<commit_message>
grokbot oba: primer v3 (landscape cuts)
</commit_message>
<xml_diff>
--- a/themes/outcome-based-agents/insights/primer.docx
+++ b/themes/outcome-based-agents/insights/primer.docx
@@ -26,7 +26,7 @@
         <w:rPr>
           <w:rStyle w:val="Emphasis"/>
         </w:rPr>
-        <w:t>Version 2, dated 2026-10-27 (America/New_York). v1 was 2026-10-26. Built from the oba repo: insights/ (framework, evidence-by-question, weekly/2026-W44, bull-bear, comps, market-sizing, startup-landscape, labs-vs-startups, timeline, expert-calls), companies/ cards, and the sources/ records named in Appendix C. Free sources only, plus the AlphaSense expert calls filed in the repo. Reading log and per-source notes: insights/primer-notes/.</w:t>
+        <w:t>Version 3, dated 2026-10-27 (America/New_York). v2 was earlier on 2026-10-27; v1 was 2026-10-26. Built from the oba repo: insights/ (framework, evidence-by-question, weekly/2026-W44, bull-bear, comps, market-sizing, startup-landscape, labs-vs-startups, timeline, expert-calls), companies/ cards, and the sources/ records named in Appendix C. Free sources only, plus the AlphaSense expert calls filed in the repo. Reading log and per-source notes: insights/primer-notes/.</w:t>
       </w:r>
     </w:p>
     <w:p>
@@ -58,6 +58,24 @@
         <w:rPr>
           <w:rStyle w:val="Strong"/>
         </w:rPr>
+        <w:t>What changed in v3.</w:t>
+      </w:r>
+      <w:r>
+        <w:rPr/>
+        <w:t xml:space="preserve"> New Section 8: six landscape cuts of 65 startups (five worlds, buyer, pricing, channel, stage, thesis fit), one group per company per cut. Full version: insights/landscape-cuts.md.</w:t>
+      </w:r>
+    </w:p>
+    <w:p>
+      <w:pPr>
+        <w:pStyle w:val="BodyText"/>
+        <w:bidi w:val="0"/>
+        <w:jc w:val="left"/>
+        <w:rPr/>
+      </w:pPr>
+      <w:r>
+        <w:rPr>
+          <w:rStyle w:val="Strong"/>
+        </w:rPr>
         <w:t>Start here.</w:t>
       </w:r>
       <w:r>
@@ -165,6 +183,28 @@
           <w:tab w:val="left" w:pos="769" w:leader="none"/>
         </w:tabs>
         <w:bidi w:val="0"/>
+        <w:spacing w:before="60" w:after="0"/>
+        <w:ind w:hanging="283" w:left="769"/>
+        <w:jc w:val="left"/>
+        <w:rPr/>
+      </w:pPr>
+      <w:r>
+        <w:rPr/>
+        <w:t xml:space="preserve">Section 8 shows where every startup sits, cut six ways. Read it after Section 3. </w:t>
+      </w:r>
+    </w:p>
+    <w:p>
+      <w:pPr>
+        <w:pStyle w:val="BodyText"/>
+        <w:numPr>
+          <w:ilvl w:val="0"/>
+          <w:numId w:val="1"/>
+        </w:numPr>
+        <w:tabs>
+          <w:tab w:val="clear" w:pos="1134"/>
+          <w:tab w:val="left" w:pos="769" w:leader="none"/>
+        </w:tabs>
+        <w:bidi w:val="0"/>
         <w:ind w:hanging="283" w:left="769"/>
         <w:jc w:val="left"/>
         <w:rPr/>
@@ -172,6 +212,24 @@
       <w:r>
         <w:rPr/>
         <w:t xml:space="preserve">Appendix A is a glossary. Every acronym is spelled out the first time it appears and again in the glossary. </w:t>
+      </w:r>
+    </w:p>
+    <w:p>
+      <w:pPr>
+        <w:pStyle w:val="BodyText"/>
+        <w:bidi w:val="0"/>
+        <w:jc w:val="left"/>
+        <w:rPr/>
+      </w:pPr>
+      <w:r>
+        <w:rPr>
+          <w:rStyle w:val="Strong"/>
+        </w:rPr>
+        <w:t>Contents.</w:t>
+      </w:r>
+      <w:r>
+        <w:rPr/>
+        <w:t xml:space="preserve"> 0 Decision summary; 1 Big picture; 2 The 17 questions; 3 Company profiles; 4 Unit economics; 5 Data loops and moats; 6 Bear case; 7 Open questions; 8 Landscape cuts; Appendices A Glossary, B Gaps, C Source coverage.</w:t>
       </w:r>
     </w:p>
     <w:p>
@@ -16706,6 +16764,3231 @@
       </w:pPr>
       <w:r>
         <w:rPr/>
+      </w:r>
+    </w:p>
+    <w:p>
+      <w:pPr>
+        <w:pStyle w:val="Heading2"/>
+        <w:bidi w:val="0"/>
+        <w:jc w:val="left"/>
+        <w:rPr/>
+      </w:pPr>
+      <w:r>
+        <w:rPr/>
+        <w:t>8. Landscape cuts: where each company sits</w:t>
+      </w:r>
+    </w:p>
+    <w:p>
+      <w:pPr>
+        <w:pStyle w:val="BodyText"/>
+        <w:bidi w:val="0"/>
+        <w:jc w:val="left"/>
+        <w:rPr/>
+      </w:pPr>
+      <w:r>
+        <w:rPr/>
+        <w:t>65 startups, cut six ways. Each sits in exactly one group per cut. Full table with a source id on every row: insights/landscape-cuts.md. Pricing and stage come only from filed sources; thesis position is [inference].</w:t>
+      </w:r>
+    </w:p>
+    <w:p>
+      <w:pPr>
+        <w:pStyle w:val="Heading3"/>
+        <w:bidi w:val="0"/>
+        <w:jc w:val="left"/>
+        <w:rPr/>
+      </w:pPr>
+      <w:r>
+        <w:rPr/>
+        <w:t>8.1 The five worlds</w:t>
+      </w:r>
+    </w:p>
+    <w:p>
+      <w:pPr>
+        <w:pStyle w:val="BodyText"/>
+        <w:bidi w:val="0"/>
+        <w:jc w:val="left"/>
+        <w:rPr/>
+      </w:pPr>
+      <w:r>
+        <w:rPr/>
+        <w:t>Incumbents: labs and hyperscalers (OpenAI, Anthropic, Google, Microsoft, Amazon Web Services); systems of record (Salesforce, ServiceNow, SAP, Oracle, Workday and others); SIs and BPOs (Accenture, Cognizant, Infosys, TCS and others). No startup sits in "enterprises building their own".</w:t>
+      </w:r>
+    </w:p>
+    <w:p>
+      <w:pPr>
+        <w:pStyle w:val="BodyText"/>
+        <w:keepLines/>
+        <w:bidi w:val="0"/>
+        <w:spacing w:before="60" w:after="60"/>
+        <w:ind w:hanging="0" w:left="140" w:right="140"/>
+        <w:jc w:val="left"/>
+        <w:rPr>
+          <w:b/>
+          <w:bdr w:val="single" w:sz="2" w:space="3" w:color="BBBBBB"/>
+        </w:rPr>
+      </w:pPr>
+      <w:r>
+        <w:rPr>
+          <w:b/>
+          <w:bdr w:val="single" w:sz="2" w:space="3" w:color="BBBBBB"/>
+        </w:rPr>
+        <w:t>Vertical apps</w:t>
+      </w:r>
+    </w:p>
+    <w:p>
+      <w:pPr>
+        <w:pStyle w:val="BodyText"/>
+        <w:keepLines/>
+        <w:bidi w:val="0"/>
+        <w:spacing w:before="20" w:after="20"/>
+        <w:ind w:hanging="0" w:left="160" w:right="160"/>
+        <w:jc w:val="left"/>
+        <w:rPr>
+          <w:sz w:val="19"/>
+          <w:bdr w:val="single" w:sz="2" w:space="3" w:color="BBBBBB"/>
+        </w:rPr>
+      </w:pPr>
+      <w:r>
+        <w:rPr>
+          <w:b/>
+          <w:color w:val="444444"/>
+          <w:sz w:val="19"/>
+          <w:bdr w:val="single" w:sz="2" w:space="3" w:color="BBBBBB"/>
+        </w:rPr>
+        <w:t>n:</w:t>
+      </w:r>
+      <w:r>
+        <w:rPr>
+          <w:sz w:val="19"/>
+          <w:bdr w:val="single" w:sz="2" w:space="3" w:color="BBBBBB"/>
+        </w:rPr>
+        <w:t xml:space="preserve"> 39</w:t>
+      </w:r>
+    </w:p>
+    <w:p>
+      <w:pPr>
+        <w:pStyle w:val="BodyText"/>
+        <w:keepLines/>
+        <w:bidi w:val="0"/>
+        <w:spacing w:before="20" w:after="20"/>
+        <w:ind w:hanging="0" w:left="160" w:right="160"/>
+        <w:jc w:val="left"/>
+        <w:rPr>
+          <w:sz w:val="19"/>
+          <w:bdr w:val="single" w:sz="2" w:space="3" w:color="BBBBBB"/>
+        </w:rPr>
+      </w:pPr>
+      <w:r>
+        <w:rPr>
+          <w:b/>
+          <w:color w:val="444444"/>
+          <w:sz w:val="19"/>
+          <w:bdr w:val="single" w:sz="2" w:space="3" w:color="BBBBBB"/>
+        </w:rPr>
+        <w:t>Who:</w:t>
+      </w:r>
+      <w:r>
+        <w:rPr>
+          <w:sz w:val="19"/>
+          <w:bdr w:val="single" w:sz="2" w:space="3" w:color="BBBBBB"/>
+        </w:rPr>
+        <w:t xml:space="preserve"> Actively AI, Attention, Vida, Sierra, Decagon, Omilia, respond.io, Cresta, Moveworks, Adaptive, Basis, Definite, Elimentary, Xelix, Zolvo, Zomma, Didero, Lio, Magentic, Walter, Pactum, Pavus AI, Adonis, Amperos Health, Candid Health, GenHealth.ai, Procode, Prosper AI, ClearRisk AI, Notch, Pace, Crosby, Ivo, Wordsmith, Orbio, Spott, Take2, NeuBird AI, Crescendo</w:t>
+      </w:r>
+    </w:p>
+    <w:p>
+      <w:pPr>
+        <w:pStyle w:val="BodyText"/>
+        <w:keepLines/>
+        <w:bidi w:val="0"/>
+        <w:spacing w:before="60" w:after="60"/>
+        <w:ind w:hanging="0" w:left="140" w:right="140"/>
+        <w:jc w:val="left"/>
+        <w:rPr>
+          <w:b/>
+          <w:bdr w:val="single" w:sz="2" w:space="3" w:color="BBBBBB"/>
+        </w:rPr>
+      </w:pPr>
+      <w:r>
+        <w:rPr>
+          <w:b/>
+          <w:bdr w:val="single" w:sz="2" w:space="3" w:color="BBBBBB"/>
+        </w:rPr>
+        <w:t>Horizontal orchestration</w:t>
+      </w:r>
+    </w:p>
+    <w:p>
+      <w:pPr>
+        <w:pStyle w:val="BodyText"/>
+        <w:keepLines/>
+        <w:bidi w:val="0"/>
+        <w:spacing w:before="20" w:after="20"/>
+        <w:ind w:hanging="0" w:left="160" w:right="160"/>
+        <w:jc w:val="left"/>
+        <w:rPr>
+          <w:sz w:val="19"/>
+          <w:bdr w:val="single" w:sz="2" w:space="3" w:color="BBBBBB"/>
+        </w:rPr>
+      </w:pPr>
+      <w:r>
+        <w:rPr>
+          <w:b/>
+          <w:color w:val="444444"/>
+          <w:sz w:val="19"/>
+          <w:bdr w:val="single" w:sz="2" w:space="3" w:color="BBBBBB"/>
+        </w:rPr>
+        <w:t>n:</w:t>
+      </w:r>
+      <w:r>
+        <w:rPr>
+          <w:sz w:val="19"/>
+          <w:bdr w:val="single" w:sz="2" w:space="3" w:color="BBBBBB"/>
+        </w:rPr>
+        <w:t xml:space="preserve"> 9</w:t>
+      </w:r>
+    </w:p>
+    <w:p>
+      <w:pPr>
+        <w:pStyle w:val="BodyText"/>
+        <w:keepLines/>
+        <w:bidi w:val="0"/>
+        <w:spacing w:before="20" w:after="20"/>
+        <w:ind w:hanging="0" w:left="160" w:right="160"/>
+        <w:jc w:val="left"/>
+        <w:rPr>
+          <w:sz w:val="19"/>
+          <w:bdr w:val="single" w:sz="2" w:space="3" w:color="BBBBBB"/>
+        </w:rPr>
+      </w:pPr>
+      <w:r>
+        <w:rPr>
+          <w:b/>
+          <w:color w:val="444444"/>
+          <w:sz w:val="19"/>
+          <w:bdr w:val="single" w:sz="2" w:space="3" w:color="BBBBBB"/>
+        </w:rPr>
+        <w:t>Who:</w:t>
+      </w:r>
+      <w:r>
+        <w:rPr>
+          <w:sz w:val="19"/>
+          <w:bdr w:val="single" w:sz="2" w:space="3" w:color="BBBBBB"/>
+        </w:rPr>
+        <w:t xml:space="preserve"> Ema, Kestra, Duvo, Sycamore, Airia, Maisa AI, Mimica, Skan AI, Workfabric AI</w:t>
+      </w:r>
+    </w:p>
+    <w:p>
+      <w:pPr>
+        <w:pStyle w:val="BodyText"/>
+        <w:keepLines/>
+        <w:bidi w:val="0"/>
+        <w:spacing w:before="60" w:after="60"/>
+        <w:ind w:hanging="0" w:left="140" w:right="140"/>
+        <w:jc w:val="left"/>
+        <w:rPr>
+          <w:b/>
+          <w:bdr w:val="single" w:sz="2" w:space="3" w:color="BBBBBB"/>
+        </w:rPr>
+      </w:pPr>
+      <w:r>
+        <w:rPr>
+          <w:b/>
+          <w:bdr w:val="single" w:sz="2" w:space="3" w:color="BBBBBB"/>
+        </w:rPr>
+        <w:t>SIs and AI services</w:t>
+      </w:r>
+    </w:p>
+    <w:p>
+      <w:pPr>
+        <w:pStyle w:val="BodyText"/>
+        <w:keepLines/>
+        <w:bidi w:val="0"/>
+        <w:spacing w:before="20" w:after="20"/>
+        <w:ind w:hanging="0" w:left="160" w:right="160"/>
+        <w:jc w:val="left"/>
+        <w:rPr>
+          <w:sz w:val="19"/>
+          <w:bdr w:val="single" w:sz="2" w:space="3" w:color="BBBBBB"/>
+        </w:rPr>
+      </w:pPr>
+      <w:r>
+        <w:rPr>
+          <w:b/>
+          <w:color w:val="444444"/>
+          <w:sz w:val="19"/>
+          <w:bdr w:val="single" w:sz="2" w:space="3" w:color="BBBBBB"/>
+        </w:rPr>
+        <w:t>n:</w:t>
+      </w:r>
+      <w:r>
+        <w:rPr>
+          <w:sz w:val="19"/>
+          <w:bdr w:val="single" w:sz="2" w:space="3" w:color="BBBBBB"/>
+        </w:rPr>
+        <w:t xml:space="preserve"> 4</w:t>
+      </w:r>
+    </w:p>
+    <w:p>
+      <w:pPr>
+        <w:pStyle w:val="BodyText"/>
+        <w:keepLines/>
+        <w:bidi w:val="0"/>
+        <w:spacing w:before="20" w:after="20"/>
+        <w:ind w:hanging="0" w:left="160" w:right="160"/>
+        <w:jc w:val="left"/>
+        <w:rPr>
+          <w:sz w:val="19"/>
+          <w:bdr w:val="single" w:sz="2" w:space="3" w:color="BBBBBB"/>
+        </w:rPr>
+      </w:pPr>
+      <w:r>
+        <w:rPr>
+          <w:b/>
+          <w:color w:val="444444"/>
+          <w:sz w:val="19"/>
+          <w:bdr w:val="single" w:sz="2" w:space="3" w:color="BBBBBB"/>
+        </w:rPr>
+        <w:t>Who:</w:t>
+      </w:r>
+      <w:r>
+        <w:rPr>
+          <w:sz w:val="19"/>
+          <w:bdr w:val="single" w:sz="2" w:space="3" w:color="BBBBBB"/>
+        </w:rPr>
+        <w:t xml:space="preserve"> DeepOpinion, Otera, RapidCanvas, AuxoAI</w:t>
+      </w:r>
+    </w:p>
+    <w:p>
+      <w:pPr>
+        <w:pStyle w:val="BodyText"/>
+        <w:keepLines/>
+        <w:bidi w:val="0"/>
+        <w:spacing w:before="60" w:after="60"/>
+        <w:ind w:hanging="0" w:left="140" w:right="140"/>
+        <w:jc w:val="left"/>
+        <w:rPr>
+          <w:b/>
+          <w:bdr w:val="single" w:sz="2" w:space="3" w:color="BBBBBB"/>
+        </w:rPr>
+      </w:pPr>
+      <w:r>
+        <w:rPr>
+          <w:b/>
+          <w:bdr w:val="single" w:sz="2" w:space="3" w:color="BBBBBB"/>
+        </w:rPr>
+        <w:t>Agent infrastructure</w:t>
+      </w:r>
+    </w:p>
+    <w:p>
+      <w:pPr>
+        <w:pStyle w:val="BodyText"/>
+        <w:keepLines/>
+        <w:bidi w:val="0"/>
+        <w:spacing w:before="20" w:after="20"/>
+        <w:ind w:hanging="0" w:left="160" w:right="160"/>
+        <w:jc w:val="left"/>
+        <w:rPr>
+          <w:sz w:val="19"/>
+          <w:bdr w:val="single" w:sz="2" w:space="3" w:color="BBBBBB"/>
+        </w:rPr>
+      </w:pPr>
+      <w:r>
+        <w:rPr>
+          <w:b/>
+          <w:color w:val="444444"/>
+          <w:sz w:val="19"/>
+          <w:bdr w:val="single" w:sz="2" w:space="3" w:color="BBBBBB"/>
+        </w:rPr>
+        <w:t>n:</w:t>
+      </w:r>
+      <w:r>
+        <w:rPr>
+          <w:sz w:val="19"/>
+          <w:bdr w:val="single" w:sz="2" w:space="3" w:color="BBBBBB"/>
+        </w:rPr>
+        <w:t xml:space="preserve"> 13</w:t>
+      </w:r>
+    </w:p>
+    <w:p>
+      <w:pPr>
+        <w:pStyle w:val="BodyText"/>
+        <w:keepLines/>
+        <w:bidi w:val="0"/>
+        <w:spacing w:before="20" w:after="20"/>
+        <w:ind w:hanging="0" w:left="160" w:right="160"/>
+        <w:jc w:val="left"/>
+        <w:rPr>
+          <w:sz w:val="19"/>
+          <w:bdr w:val="single" w:sz="2" w:space="3" w:color="BBBBBB"/>
+        </w:rPr>
+      </w:pPr>
+      <w:r>
+        <w:rPr>
+          <w:b/>
+          <w:color w:val="444444"/>
+          <w:sz w:val="19"/>
+          <w:bdr w:val="single" w:sz="2" w:space="3" w:color="BBBBBB"/>
+        </w:rPr>
+        <w:t>Who:</w:t>
+      </w:r>
+      <w:r>
+        <w:rPr>
+          <w:sz w:val="19"/>
+          <w:bdr w:val="single" w:sz="2" w:space="3" w:color="BBBBBB"/>
+        </w:rPr>
+        <w:t xml:space="preserve"> CopilotKit, Coval, Dash0, Daytona, Flexprice, InsightFinder, Natural, Raindrop, Rein, Runlayer, Tsuga, LangChain, ElevenLabs</w:t>
+      </w:r>
+    </w:p>
+    <w:p>
+      <w:pPr>
+        <w:pStyle w:val="BodyText"/>
+        <w:bidi w:val="0"/>
+        <w:jc w:val="left"/>
+        <w:rPr/>
+      </w:pPr>
+      <w:r>
+        <w:rPr>
+          <w:rStyle w:val="Strong"/>
+        </w:rPr>
+        <w:t>What this means:</w:t>
+      </w:r>
+      <w:r>
+        <w:rPr/>
+        <w:t xml:space="preserve"> venture money is in vertical apps; the other worlds belong to incumbents.</w:t>
+      </w:r>
+    </w:p>
+    <w:p>
+      <w:pPr>
+        <w:pStyle w:val="Heading3"/>
+        <w:bidi w:val="0"/>
+        <w:jc w:val="left"/>
+        <w:rPr/>
+      </w:pPr>
+      <w:r>
+        <w:rPr/>
+        <w:t>8.2 Buyer function</w:t>
+      </w:r>
+    </w:p>
+    <w:p>
+      <w:pPr>
+        <w:pStyle w:val="BodyText"/>
+        <w:keepLines/>
+        <w:bidi w:val="0"/>
+        <w:spacing w:before="60" w:after="60"/>
+        <w:ind w:hanging="0" w:left="140" w:right="140"/>
+        <w:jc w:val="left"/>
+        <w:rPr>
+          <w:b/>
+          <w:bdr w:val="single" w:sz="2" w:space="3" w:color="BBBBBB"/>
+        </w:rPr>
+      </w:pPr>
+      <w:r>
+        <w:rPr>
+          <w:b/>
+          <w:bdr w:val="single" w:sz="2" w:space="3" w:color="BBBBBB"/>
+        </w:rPr>
+        <w:t>Customer service and contact center</w:t>
+      </w:r>
+    </w:p>
+    <w:p>
+      <w:pPr>
+        <w:pStyle w:val="BodyText"/>
+        <w:keepLines/>
+        <w:bidi w:val="0"/>
+        <w:spacing w:before="20" w:after="20"/>
+        <w:ind w:hanging="0" w:left="160" w:right="160"/>
+        <w:jc w:val="left"/>
+        <w:rPr>
+          <w:sz w:val="19"/>
+          <w:bdr w:val="single" w:sz="2" w:space="3" w:color="BBBBBB"/>
+        </w:rPr>
+      </w:pPr>
+      <w:r>
+        <w:rPr>
+          <w:b/>
+          <w:color w:val="444444"/>
+          <w:sz w:val="19"/>
+          <w:bdr w:val="single" w:sz="2" w:space="3" w:color="BBBBBB"/>
+        </w:rPr>
+        <w:t>n:</w:t>
+      </w:r>
+      <w:r>
+        <w:rPr>
+          <w:sz w:val="19"/>
+          <w:bdr w:val="single" w:sz="2" w:space="3" w:color="BBBBBB"/>
+        </w:rPr>
+        <w:t xml:space="preserve"> 7</w:t>
+      </w:r>
+    </w:p>
+    <w:p>
+      <w:pPr>
+        <w:pStyle w:val="BodyText"/>
+        <w:keepLines/>
+        <w:bidi w:val="0"/>
+        <w:spacing w:before="20" w:after="20"/>
+        <w:ind w:hanging="0" w:left="160" w:right="160"/>
+        <w:jc w:val="left"/>
+        <w:rPr>
+          <w:sz w:val="19"/>
+          <w:bdr w:val="single" w:sz="2" w:space="3" w:color="BBBBBB"/>
+        </w:rPr>
+      </w:pPr>
+      <w:r>
+        <w:rPr>
+          <w:b/>
+          <w:color w:val="444444"/>
+          <w:sz w:val="19"/>
+          <w:bdr w:val="single" w:sz="2" w:space="3" w:color="BBBBBB"/>
+        </w:rPr>
+        <w:t>Who:</w:t>
+      </w:r>
+      <w:r>
+        <w:rPr>
+          <w:sz w:val="19"/>
+          <w:bdr w:val="single" w:sz="2" w:space="3" w:color="BBBBBB"/>
+        </w:rPr>
+        <w:t xml:space="preserve"> ElevenLabs, Sierra, Decagon, Omilia, respond.io, Cresta, Crescendo</w:t>
+      </w:r>
+    </w:p>
+    <w:p>
+      <w:pPr>
+        <w:pStyle w:val="BodyText"/>
+        <w:keepLines/>
+        <w:bidi w:val="0"/>
+        <w:spacing w:before="60" w:after="60"/>
+        <w:ind w:hanging="0" w:left="140" w:right="140"/>
+        <w:jc w:val="left"/>
+        <w:rPr>
+          <w:b/>
+          <w:bdr w:val="single" w:sz="2" w:space="3" w:color="BBBBBB"/>
+        </w:rPr>
+      </w:pPr>
+      <w:r>
+        <w:rPr>
+          <w:b/>
+          <w:bdr w:val="single" w:sz="2" w:space="3" w:color="BBBBBB"/>
+        </w:rPr>
+        <w:t>Sales and revenue</w:t>
+      </w:r>
+    </w:p>
+    <w:p>
+      <w:pPr>
+        <w:pStyle w:val="BodyText"/>
+        <w:keepLines/>
+        <w:bidi w:val="0"/>
+        <w:spacing w:before="20" w:after="20"/>
+        <w:ind w:hanging="0" w:left="160" w:right="160"/>
+        <w:jc w:val="left"/>
+        <w:rPr>
+          <w:sz w:val="19"/>
+          <w:bdr w:val="single" w:sz="2" w:space="3" w:color="BBBBBB"/>
+        </w:rPr>
+      </w:pPr>
+      <w:r>
+        <w:rPr>
+          <w:b/>
+          <w:color w:val="444444"/>
+          <w:sz w:val="19"/>
+          <w:bdr w:val="single" w:sz="2" w:space="3" w:color="BBBBBB"/>
+        </w:rPr>
+        <w:t>n:</w:t>
+      </w:r>
+      <w:r>
+        <w:rPr>
+          <w:sz w:val="19"/>
+          <w:bdr w:val="single" w:sz="2" w:space="3" w:color="BBBBBB"/>
+        </w:rPr>
+        <w:t xml:space="preserve"> 3</w:t>
+      </w:r>
+    </w:p>
+    <w:p>
+      <w:pPr>
+        <w:pStyle w:val="BodyText"/>
+        <w:keepLines/>
+        <w:bidi w:val="0"/>
+        <w:spacing w:before="20" w:after="20"/>
+        <w:ind w:hanging="0" w:left="160" w:right="160"/>
+        <w:jc w:val="left"/>
+        <w:rPr>
+          <w:sz w:val="19"/>
+          <w:bdr w:val="single" w:sz="2" w:space="3" w:color="BBBBBB"/>
+        </w:rPr>
+      </w:pPr>
+      <w:r>
+        <w:rPr>
+          <w:b/>
+          <w:color w:val="444444"/>
+          <w:sz w:val="19"/>
+          <w:bdr w:val="single" w:sz="2" w:space="3" w:color="BBBBBB"/>
+        </w:rPr>
+        <w:t>Who:</w:t>
+      </w:r>
+      <w:r>
+        <w:rPr>
+          <w:sz w:val="19"/>
+          <w:bdr w:val="single" w:sz="2" w:space="3" w:color="BBBBBB"/>
+        </w:rPr>
+        <w:t xml:space="preserve"> Actively AI, Attention, Vida</w:t>
+      </w:r>
+    </w:p>
+    <w:p>
+      <w:pPr>
+        <w:pStyle w:val="BodyText"/>
+        <w:keepLines/>
+        <w:bidi w:val="0"/>
+        <w:spacing w:before="60" w:after="60"/>
+        <w:ind w:hanging="0" w:left="140" w:right="140"/>
+        <w:jc w:val="left"/>
+        <w:rPr>
+          <w:b/>
+          <w:bdr w:val="single" w:sz="2" w:space="3" w:color="BBBBBB"/>
+        </w:rPr>
+      </w:pPr>
+      <w:r>
+        <w:rPr>
+          <w:b/>
+          <w:bdr w:val="single" w:sz="2" w:space="3" w:color="BBBBBB"/>
+        </w:rPr>
+        <w:t>Finance, accounting and lending ops</w:t>
+      </w:r>
+    </w:p>
+    <w:p>
+      <w:pPr>
+        <w:pStyle w:val="BodyText"/>
+        <w:keepLines/>
+        <w:bidi w:val="0"/>
+        <w:spacing w:before="20" w:after="20"/>
+        <w:ind w:hanging="0" w:left="160" w:right="160"/>
+        <w:jc w:val="left"/>
+        <w:rPr>
+          <w:sz w:val="19"/>
+          <w:bdr w:val="single" w:sz="2" w:space="3" w:color="BBBBBB"/>
+        </w:rPr>
+      </w:pPr>
+      <w:r>
+        <w:rPr>
+          <w:b/>
+          <w:color w:val="444444"/>
+          <w:sz w:val="19"/>
+          <w:bdr w:val="single" w:sz="2" w:space="3" w:color="BBBBBB"/>
+        </w:rPr>
+        <w:t>n:</w:t>
+      </w:r>
+      <w:r>
+        <w:rPr>
+          <w:sz w:val="19"/>
+          <w:bdr w:val="single" w:sz="2" w:space="3" w:color="BBBBBB"/>
+        </w:rPr>
+        <w:t xml:space="preserve"> 7</w:t>
+      </w:r>
+    </w:p>
+    <w:p>
+      <w:pPr>
+        <w:pStyle w:val="BodyText"/>
+        <w:keepLines/>
+        <w:bidi w:val="0"/>
+        <w:spacing w:before="20" w:after="20"/>
+        <w:ind w:hanging="0" w:left="160" w:right="160"/>
+        <w:jc w:val="left"/>
+        <w:rPr>
+          <w:sz w:val="19"/>
+          <w:bdr w:val="single" w:sz="2" w:space="3" w:color="BBBBBB"/>
+        </w:rPr>
+      </w:pPr>
+      <w:r>
+        <w:rPr>
+          <w:b/>
+          <w:color w:val="444444"/>
+          <w:sz w:val="19"/>
+          <w:bdr w:val="single" w:sz="2" w:space="3" w:color="BBBBBB"/>
+        </w:rPr>
+        <w:t>Who:</w:t>
+      </w:r>
+      <w:r>
+        <w:rPr>
+          <w:sz w:val="19"/>
+          <w:bdr w:val="single" w:sz="2" w:space="3" w:color="BBBBBB"/>
+        </w:rPr>
+        <w:t xml:space="preserve"> Adaptive, Basis, Definite, Elimentary, Xelix, Zolvo, Zomma</w:t>
+      </w:r>
+    </w:p>
+    <w:p>
+      <w:pPr>
+        <w:pStyle w:val="BodyText"/>
+        <w:keepLines/>
+        <w:bidi w:val="0"/>
+        <w:spacing w:before="60" w:after="60"/>
+        <w:ind w:hanging="0" w:left="140" w:right="140"/>
+        <w:jc w:val="left"/>
+        <w:rPr>
+          <w:b/>
+          <w:bdr w:val="single" w:sz="2" w:space="3" w:color="BBBBBB"/>
+        </w:rPr>
+      </w:pPr>
+      <w:r>
+        <w:rPr>
+          <w:b/>
+          <w:bdr w:val="single" w:sz="2" w:space="3" w:color="BBBBBB"/>
+        </w:rPr>
+        <w:t>Procurement and supply chain</w:t>
+      </w:r>
+    </w:p>
+    <w:p>
+      <w:pPr>
+        <w:pStyle w:val="BodyText"/>
+        <w:keepLines/>
+        <w:bidi w:val="0"/>
+        <w:spacing w:before="20" w:after="20"/>
+        <w:ind w:hanging="0" w:left="160" w:right="160"/>
+        <w:jc w:val="left"/>
+        <w:rPr>
+          <w:sz w:val="19"/>
+          <w:bdr w:val="single" w:sz="2" w:space="3" w:color="BBBBBB"/>
+        </w:rPr>
+      </w:pPr>
+      <w:r>
+        <w:rPr>
+          <w:b/>
+          <w:color w:val="444444"/>
+          <w:sz w:val="19"/>
+          <w:bdr w:val="single" w:sz="2" w:space="3" w:color="BBBBBB"/>
+        </w:rPr>
+        <w:t>n:</w:t>
+      </w:r>
+      <w:r>
+        <w:rPr>
+          <w:sz w:val="19"/>
+          <w:bdr w:val="single" w:sz="2" w:space="3" w:color="BBBBBB"/>
+        </w:rPr>
+        <w:t xml:space="preserve"> 6</w:t>
+      </w:r>
+    </w:p>
+    <w:p>
+      <w:pPr>
+        <w:pStyle w:val="BodyText"/>
+        <w:keepLines/>
+        <w:bidi w:val="0"/>
+        <w:spacing w:before="20" w:after="20"/>
+        <w:ind w:hanging="0" w:left="160" w:right="160"/>
+        <w:jc w:val="left"/>
+        <w:rPr>
+          <w:sz w:val="19"/>
+          <w:bdr w:val="single" w:sz="2" w:space="3" w:color="BBBBBB"/>
+        </w:rPr>
+      </w:pPr>
+      <w:r>
+        <w:rPr>
+          <w:b/>
+          <w:color w:val="444444"/>
+          <w:sz w:val="19"/>
+          <w:bdr w:val="single" w:sz="2" w:space="3" w:color="BBBBBB"/>
+        </w:rPr>
+        <w:t>Who:</w:t>
+      </w:r>
+      <w:r>
+        <w:rPr>
+          <w:sz w:val="19"/>
+          <w:bdr w:val="single" w:sz="2" w:space="3" w:color="BBBBBB"/>
+        </w:rPr>
+        <w:t xml:space="preserve"> Didero, Lio, Magentic, Walter, Pactum, Pavus AI</w:t>
+      </w:r>
+    </w:p>
+    <w:p>
+      <w:pPr>
+        <w:pStyle w:val="BodyText"/>
+        <w:keepLines/>
+        <w:bidi w:val="0"/>
+        <w:spacing w:before="60" w:after="60"/>
+        <w:ind w:hanging="0" w:left="140" w:right="140"/>
+        <w:jc w:val="left"/>
+        <w:rPr>
+          <w:b/>
+          <w:bdr w:val="single" w:sz="2" w:space="3" w:color="BBBBBB"/>
+        </w:rPr>
+      </w:pPr>
+      <w:r>
+        <w:rPr>
+          <w:b/>
+          <w:bdr w:val="single" w:sz="2" w:space="3" w:color="BBBBBB"/>
+        </w:rPr>
+        <w:t>Healthcare revenue cycle and admin</w:t>
+      </w:r>
+    </w:p>
+    <w:p>
+      <w:pPr>
+        <w:pStyle w:val="BodyText"/>
+        <w:keepLines/>
+        <w:bidi w:val="0"/>
+        <w:spacing w:before="20" w:after="20"/>
+        <w:ind w:hanging="0" w:left="160" w:right="160"/>
+        <w:jc w:val="left"/>
+        <w:rPr>
+          <w:sz w:val="19"/>
+          <w:bdr w:val="single" w:sz="2" w:space="3" w:color="BBBBBB"/>
+        </w:rPr>
+      </w:pPr>
+      <w:r>
+        <w:rPr>
+          <w:b/>
+          <w:color w:val="444444"/>
+          <w:sz w:val="19"/>
+          <w:bdr w:val="single" w:sz="2" w:space="3" w:color="BBBBBB"/>
+        </w:rPr>
+        <w:t>n:</w:t>
+      </w:r>
+      <w:r>
+        <w:rPr>
+          <w:sz w:val="19"/>
+          <w:bdr w:val="single" w:sz="2" w:space="3" w:color="BBBBBB"/>
+        </w:rPr>
+        <w:t xml:space="preserve"> 6</w:t>
+      </w:r>
+    </w:p>
+    <w:p>
+      <w:pPr>
+        <w:pStyle w:val="BodyText"/>
+        <w:keepLines/>
+        <w:bidi w:val="0"/>
+        <w:spacing w:before="20" w:after="20"/>
+        <w:ind w:hanging="0" w:left="160" w:right="160"/>
+        <w:jc w:val="left"/>
+        <w:rPr>
+          <w:sz w:val="19"/>
+          <w:bdr w:val="single" w:sz="2" w:space="3" w:color="BBBBBB"/>
+        </w:rPr>
+      </w:pPr>
+      <w:r>
+        <w:rPr>
+          <w:b/>
+          <w:color w:val="444444"/>
+          <w:sz w:val="19"/>
+          <w:bdr w:val="single" w:sz="2" w:space="3" w:color="BBBBBB"/>
+        </w:rPr>
+        <w:t>Who:</w:t>
+      </w:r>
+      <w:r>
+        <w:rPr>
+          <w:sz w:val="19"/>
+          <w:bdr w:val="single" w:sz="2" w:space="3" w:color="BBBBBB"/>
+        </w:rPr>
+        <w:t xml:space="preserve"> Adonis, Amperos Health, Candid Health, GenHealth.ai, Procode, Prosper AI</w:t>
+      </w:r>
+    </w:p>
+    <w:p>
+      <w:pPr>
+        <w:pStyle w:val="BodyText"/>
+        <w:keepLines/>
+        <w:bidi w:val="0"/>
+        <w:spacing w:before="60" w:after="60"/>
+        <w:ind w:hanging="0" w:left="140" w:right="140"/>
+        <w:jc w:val="left"/>
+        <w:rPr>
+          <w:b/>
+          <w:bdr w:val="single" w:sz="2" w:space="3" w:color="BBBBBB"/>
+        </w:rPr>
+      </w:pPr>
+      <w:r>
+        <w:rPr>
+          <w:b/>
+          <w:bdr w:val="single" w:sz="2" w:space="3" w:color="BBBBBB"/>
+        </w:rPr>
+        <w:t>Insurance and regulated ops</w:t>
+      </w:r>
+    </w:p>
+    <w:p>
+      <w:pPr>
+        <w:pStyle w:val="BodyText"/>
+        <w:keepLines/>
+        <w:bidi w:val="0"/>
+        <w:spacing w:before="20" w:after="20"/>
+        <w:ind w:hanging="0" w:left="160" w:right="160"/>
+        <w:jc w:val="left"/>
+        <w:rPr>
+          <w:sz w:val="19"/>
+          <w:bdr w:val="single" w:sz="2" w:space="3" w:color="BBBBBB"/>
+        </w:rPr>
+      </w:pPr>
+      <w:r>
+        <w:rPr>
+          <w:b/>
+          <w:color w:val="444444"/>
+          <w:sz w:val="19"/>
+          <w:bdr w:val="single" w:sz="2" w:space="3" w:color="BBBBBB"/>
+        </w:rPr>
+        <w:t>n:</w:t>
+      </w:r>
+      <w:r>
+        <w:rPr>
+          <w:sz w:val="19"/>
+          <w:bdr w:val="single" w:sz="2" w:space="3" w:color="BBBBBB"/>
+        </w:rPr>
+        <w:t xml:space="preserve"> 5</w:t>
+      </w:r>
+    </w:p>
+    <w:p>
+      <w:pPr>
+        <w:pStyle w:val="BodyText"/>
+        <w:keepLines/>
+        <w:bidi w:val="0"/>
+        <w:spacing w:before="20" w:after="20"/>
+        <w:ind w:hanging="0" w:left="160" w:right="160"/>
+        <w:jc w:val="left"/>
+        <w:rPr>
+          <w:sz w:val="19"/>
+          <w:bdr w:val="single" w:sz="2" w:space="3" w:color="BBBBBB"/>
+        </w:rPr>
+      </w:pPr>
+      <w:r>
+        <w:rPr>
+          <w:b/>
+          <w:color w:val="444444"/>
+          <w:sz w:val="19"/>
+          <w:bdr w:val="single" w:sz="2" w:space="3" w:color="BBBBBB"/>
+        </w:rPr>
+        <w:t>Who:</w:t>
+      </w:r>
+      <w:r>
+        <w:rPr>
+          <w:sz w:val="19"/>
+          <w:bdr w:val="single" w:sz="2" w:space="3" w:color="BBBBBB"/>
+        </w:rPr>
+        <w:t xml:space="preserve"> DeepOpinion, ClearRisk AI, Notch, Pace, Otera</w:t>
+      </w:r>
+    </w:p>
+    <w:p>
+      <w:pPr>
+        <w:pStyle w:val="BodyText"/>
+        <w:keepLines/>
+        <w:bidi w:val="0"/>
+        <w:spacing w:before="60" w:after="60"/>
+        <w:ind w:hanging="0" w:left="140" w:right="140"/>
+        <w:jc w:val="left"/>
+        <w:rPr>
+          <w:b/>
+          <w:bdr w:val="single" w:sz="2" w:space="3" w:color="BBBBBB"/>
+        </w:rPr>
+      </w:pPr>
+      <w:r>
+        <w:rPr>
+          <w:b/>
+          <w:bdr w:val="single" w:sz="2" w:space="3" w:color="BBBBBB"/>
+        </w:rPr>
+        <w:t>Legal</w:t>
+      </w:r>
+    </w:p>
+    <w:p>
+      <w:pPr>
+        <w:pStyle w:val="BodyText"/>
+        <w:keepLines/>
+        <w:bidi w:val="0"/>
+        <w:spacing w:before="20" w:after="20"/>
+        <w:ind w:hanging="0" w:left="160" w:right="160"/>
+        <w:jc w:val="left"/>
+        <w:rPr>
+          <w:sz w:val="19"/>
+          <w:bdr w:val="single" w:sz="2" w:space="3" w:color="BBBBBB"/>
+        </w:rPr>
+      </w:pPr>
+      <w:r>
+        <w:rPr>
+          <w:b/>
+          <w:color w:val="444444"/>
+          <w:sz w:val="19"/>
+          <w:bdr w:val="single" w:sz="2" w:space="3" w:color="BBBBBB"/>
+        </w:rPr>
+        <w:t>n:</w:t>
+      </w:r>
+      <w:r>
+        <w:rPr>
+          <w:sz w:val="19"/>
+          <w:bdr w:val="single" w:sz="2" w:space="3" w:color="BBBBBB"/>
+        </w:rPr>
+        <w:t xml:space="preserve"> 3</w:t>
+      </w:r>
+    </w:p>
+    <w:p>
+      <w:pPr>
+        <w:pStyle w:val="BodyText"/>
+        <w:keepLines/>
+        <w:bidi w:val="0"/>
+        <w:spacing w:before="20" w:after="20"/>
+        <w:ind w:hanging="0" w:left="160" w:right="160"/>
+        <w:jc w:val="left"/>
+        <w:rPr>
+          <w:sz w:val="19"/>
+          <w:bdr w:val="single" w:sz="2" w:space="3" w:color="BBBBBB"/>
+        </w:rPr>
+      </w:pPr>
+      <w:r>
+        <w:rPr>
+          <w:b/>
+          <w:color w:val="444444"/>
+          <w:sz w:val="19"/>
+          <w:bdr w:val="single" w:sz="2" w:space="3" w:color="BBBBBB"/>
+        </w:rPr>
+        <w:t>Who:</w:t>
+      </w:r>
+      <w:r>
+        <w:rPr>
+          <w:sz w:val="19"/>
+          <w:bdr w:val="single" w:sz="2" w:space="3" w:color="BBBBBB"/>
+        </w:rPr>
+        <w:t xml:space="preserve"> Crosby, Ivo, Wordsmith</w:t>
+      </w:r>
+    </w:p>
+    <w:p>
+      <w:pPr>
+        <w:pStyle w:val="BodyText"/>
+        <w:keepLines/>
+        <w:bidi w:val="0"/>
+        <w:spacing w:before="60" w:after="60"/>
+        <w:ind w:hanging="0" w:left="140" w:right="140"/>
+        <w:jc w:val="left"/>
+        <w:rPr>
+          <w:b/>
+          <w:bdr w:val="single" w:sz="2" w:space="3" w:color="BBBBBB"/>
+        </w:rPr>
+      </w:pPr>
+      <w:r>
+        <w:rPr>
+          <w:b/>
+          <w:bdr w:val="single" w:sz="2" w:space="3" w:color="BBBBBB"/>
+        </w:rPr>
+        <w:t>HR and recruiting</w:t>
+      </w:r>
+    </w:p>
+    <w:p>
+      <w:pPr>
+        <w:pStyle w:val="BodyText"/>
+        <w:keepLines/>
+        <w:bidi w:val="0"/>
+        <w:spacing w:before="20" w:after="20"/>
+        <w:ind w:hanging="0" w:left="160" w:right="160"/>
+        <w:jc w:val="left"/>
+        <w:rPr>
+          <w:sz w:val="19"/>
+          <w:bdr w:val="single" w:sz="2" w:space="3" w:color="BBBBBB"/>
+        </w:rPr>
+      </w:pPr>
+      <w:r>
+        <w:rPr>
+          <w:b/>
+          <w:color w:val="444444"/>
+          <w:sz w:val="19"/>
+          <w:bdr w:val="single" w:sz="2" w:space="3" w:color="BBBBBB"/>
+        </w:rPr>
+        <w:t>n:</w:t>
+      </w:r>
+      <w:r>
+        <w:rPr>
+          <w:sz w:val="19"/>
+          <w:bdr w:val="single" w:sz="2" w:space="3" w:color="BBBBBB"/>
+        </w:rPr>
+        <w:t xml:space="preserve"> 3</w:t>
+      </w:r>
+    </w:p>
+    <w:p>
+      <w:pPr>
+        <w:pStyle w:val="BodyText"/>
+        <w:keepLines/>
+        <w:bidi w:val="0"/>
+        <w:spacing w:before="20" w:after="20"/>
+        <w:ind w:hanging="0" w:left="160" w:right="160"/>
+        <w:jc w:val="left"/>
+        <w:rPr>
+          <w:sz w:val="19"/>
+          <w:bdr w:val="single" w:sz="2" w:space="3" w:color="BBBBBB"/>
+        </w:rPr>
+      </w:pPr>
+      <w:r>
+        <w:rPr>
+          <w:b/>
+          <w:color w:val="444444"/>
+          <w:sz w:val="19"/>
+          <w:bdr w:val="single" w:sz="2" w:space="3" w:color="BBBBBB"/>
+        </w:rPr>
+        <w:t>Who:</w:t>
+      </w:r>
+      <w:r>
+        <w:rPr>
+          <w:sz w:val="19"/>
+          <w:bdr w:val="single" w:sz="2" w:space="3" w:color="BBBBBB"/>
+        </w:rPr>
+        <w:t xml:space="preserve"> Orbio, Spott, Take2</w:t>
+      </w:r>
+    </w:p>
+    <w:p>
+      <w:pPr>
+        <w:pStyle w:val="BodyText"/>
+        <w:keepLines/>
+        <w:bidi w:val="0"/>
+        <w:spacing w:before="60" w:after="60"/>
+        <w:ind w:hanging="0" w:left="140" w:right="140"/>
+        <w:jc w:val="left"/>
+        <w:rPr>
+          <w:b/>
+          <w:bdr w:val="single" w:sz="2" w:space="3" w:color="BBBBBB"/>
+        </w:rPr>
+      </w:pPr>
+      <w:r>
+        <w:rPr>
+          <w:b/>
+          <w:bdr w:val="single" w:sz="2" w:space="3" w:color="BBBBBB"/>
+        </w:rPr>
+        <w:t>IT ops and agent infrastructure (sold to engineering)</w:t>
+      </w:r>
+    </w:p>
+    <w:p>
+      <w:pPr>
+        <w:pStyle w:val="BodyText"/>
+        <w:keepLines/>
+        <w:bidi w:val="0"/>
+        <w:spacing w:before="20" w:after="20"/>
+        <w:ind w:hanging="0" w:left="160" w:right="160"/>
+        <w:jc w:val="left"/>
+        <w:rPr>
+          <w:sz w:val="19"/>
+          <w:bdr w:val="single" w:sz="2" w:space="3" w:color="BBBBBB"/>
+        </w:rPr>
+      </w:pPr>
+      <w:r>
+        <w:rPr>
+          <w:b/>
+          <w:color w:val="444444"/>
+          <w:sz w:val="19"/>
+          <w:bdr w:val="single" w:sz="2" w:space="3" w:color="BBBBBB"/>
+        </w:rPr>
+        <w:t>n:</w:t>
+      </w:r>
+      <w:r>
+        <w:rPr>
+          <w:sz w:val="19"/>
+          <w:bdr w:val="single" w:sz="2" w:space="3" w:color="BBBBBB"/>
+        </w:rPr>
+        <w:t xml:space="preserve"> 14</w:t>
+      </w:r>
+    </w:p>
+    <w:p>
+      <w:pPr>
+        <w:pStyle w:val="BodyText"/>
+        <w:keepLines/>
+        <w:bidi w:val="0"/>
+        <w:spacing w:before="20" w:after="20"/>
+        <w:ind w:hanging="0" w:left="160" w:right="160"/>
+        <w:jc w:val="left"/>
+        <w:rPr>
+          <w:sz w:val="19"/>
+          <w:bdr w:val="single" w:sz="2" w:space="3" w:color="BBBBBB"/>
+        </w:rPr>
+      </w:pPr>
+      <w:r>
+        <w:rPr>
+          <w:b/>
+          <w:color w:val="444444"/>
+          <w:sz w:val="19"/>
+          <w:bdr w:val="single" w:sz="2" w:space="3" w:color="BBBBBB"/>
+        </w:rPr>
+        <w:t>Who:</w:t>
+      </w:r>
+      <w:r>
+        <w:rPr>
+          <w:sz w:val="19"/>
+          <w:bdr w:val="single" w:sz="2" w:space="3" w:color="BBBBBB"/>
+        </w:rPr>
+        <w:t xml:space="preserve"> CopilotKit, Coval, Dash0, Daytona, Flexprice, InsightFinder, Natural, Raindrop, Rein, Runlayer, Tsuga, LangChain, Moveworks, NeuBird AI</w:t>
+      </w:r>
+    </w:p>
+    <w:p>
+      <w:pPr>
+        <w:pStyle w:val="BodyText"/>
+        <w:keepLines/>
+        <w:bidi w:val="0"/>
+        <w:spacing w:before="60" w:after="60"/>
+        <w:ind w:hanging="0" w:left="140" w:right="140"/>
+        <w:jc w:val="left"/>
+        <w:rPr>
+          <w:b/>
+          <w:bdr w:val="single" w:sz="2" w:space="3" w:color="BBBBBB"/>
+        </w:rPr>
+      </w:pPr>
+      <w:r>
+        <w:rPr>
+          <w:b/>
+          <w:bdr w:val="single" w:sz="2" w:space="3" w:color="BBBBBB"/>
+        </w:rPr>
+        <w:t>Cross-function (no single buyer)</w:t>
+      </w:r>
+    </w:p>
+    <w:p>
+      <w:pPr>
+        <w:pStyle w:val="BodyText"/>
+        <w:keepLines/>
+        <w:bidi w:val="0"/>
+        <w:spacing w:before="20" w:after="20"/>
+        <w:ind w:hanging="0" w:left="160" w:right="160"/>
+        <w:jc w:val="left"/>
+        <w:rPr>
+          <w:sz w:val="19"/>
+          <w:bdr w:val="single" w:sz="2" w:space="3" w:color="BBBBBB"/>
+        </w:rPr>
+      </w:pPr>
+      <w:r>
+        <w:rPr>
+          <w:b/>
+          <w:color w:val="444444"/>
+          <w:sz w:val="19"/>
+          <w:bdr w:val="single" w:sz="2" w:space="3" w:color="BBBBBB"/>
+        </w:rPr>
+        <w:t>n:</w:t>
+      </w:r>
+      <w:r>
+        <w:rPr>
+          <w:sz w:val="19"/>
+          <w:bdr w:val="single" w:sz="2" w:space="3" w:color="BBBBBB"/>
+        </w:rPr>
+        <w:t xml:space="preserve"> 11</w:t>
+      </w:r>
+    </w:p>
+    <w:p>
+      <w:pPr>
+        <w:pStyle w:val="BodyText"/>
+        <w:keepLines/>
+        <w:bidi w:val="0"/>
+        <w:spacing w:before="20" w:after="20"/>
+        <w:ind w:hanging="0" w:left="160" w:right="160"/>
+        <w:jc w:val="left"/>
+        <w:rPr>
+          <w:sz w:val="19"/>
+          <w:bdr w:val="single" w:sz="2" w:space="3" w:color="BBBBBB"/>
+        </w:rPr>
+      </w:pPr>
+      <w:r>
+        <w:rPr>
+          <w:b/>
+          <w:color w:val="444444"/>
+          <w:sz w:val="19"/>
+          <w:bdr w:val="single" w:sz="2" w:space="3" w:color="BBBBBB"/>
+        </w:rPr>
+        <w:t>Who:</w:t>
+      </w:r>
+      <w:r>
+        <w:rPr>
+          <w:sz w:val="19"/>
+          <w:bdr w:val="single" w:sz="2" w:space="3" w:color="BBBBBB"/>
+        </w:rPr>
+        <w:t xml:space="preserve"> Ema, Kestra, Duvo, Sycamore, Airia, Maisa AI, Mimica, Skan AI, Workfabric AI, RapidCanvas, AuxoAI</w:t>
+      </w:r>
+    </w:p>
+    <w:p>
+      <w:pPr>
+        <w:pStyle w:val="BodyText"/>
+        <w:bidi w:val="0"/>
+        <w:jc w:val="left"/>
+        <w:rPr/>
+      </w:pPr>
+      <w:r>
+        <w:rPr>
+          <w:rStyle w:val="Strong"/>
+        </w:rPr>
+        <w:t>What this means:</w:t>
+      </w:r>
+      <w:r>
+        <w:rPr/>
+        <w:t xml:space="preserve"> CX is crowded and late stage; finance, procurement, healthcare billing and insurance hold most early picks.</w:t>
+      </w:r>
+    </w:p>
+    <w:p>
+      <w:pPr>
+        <w:pStyle w:val="Heading3"/>
+        <w:bidi w:val="0"/>
+        <w:jc w:val="left"/>
+        <w:rPr/>
+      </w:pPr>
+      <w:r>
+        <w:rPr/>
+        <w:t>8.3 Pricing model</w:t>
+      </w:r>
+    </w:p>
+    <w:p>
+      <w:pPr>
+        <w:pStyle w:val="BodyText"/>
+        <w:bidi w:val="0"/>
+        <w:jc w:val="left"/>
+        <w:rPr/>
+      </w:pPr>
+      <w:r>
+        <w:rPr/>
+        <w:t>Sierra: under $2 per transaction plus about 10% of savings [src-20260710-37d40b]. Decagon: per meaningful conversation [src-20260515-de88a1]. Crescendo: per contact [src-20260724-865e53]. Outcome rows are company claims from their own releases.</w:t>
+      </w:r>
+    </w:p>
+    <w:p>
+      <w:pPr>
+        <w:pStyle w:val="BodyText"/>
+        <w:keepLines/>
+        <w:bidi w:val="0"/>
+        <w:spacing w:before="60" w:after="60"/>
+        <w:ind w:hanging="0" w:left="140" w:right="140"/>
+        <w:jc w:val="left"/>
+        <w:rPr>
+          <w:b/>
+          <w:bdr w:val="single" w:sz="2" w:space="3" w:color="BBBBBB"/>
+        </w:rPr>
+      </w:pPr>
+      <w:r>
+        <w:rPr>
+          <w:b/>
+          <w:bdr w:val="single" w:sz="2" w:space="3" w:color="BBBBBB"/>
+        </w:rPr>
+        <w:t>Per outcome or savings share</w:t>
+      </w:r>
+    </w:p>
+    <w:p>
+      <w:pPr>
+        <w:pStyle w:val="BodyText"/>
+        <w:keepLines/>
+        <w:bidi w:val="0"/>
+        <w:spacing w:before="20" w:after="20"/>
+        <w:ind w:hanging="0" w:left="160" w:right="160"/>
+        <w:jc w:val="left"/>
+        <w:rPr>
+          <w:sz w:val="19"/>
+          <w:bdr w:val="single" w:sz="2" w:space="3" w:color="BBBBBB"/>
+        </w:rPr>
+      </w:pPr>
+      <w:r>
+        <w:rPr>
+          <w:b/>
+          <w:color w:val="444444"/>
+          <w:sz w:val="19"/>
+          <w:bdr w:val="single" w:sz="2" w:space="3" w:color="BBBBBB"/>
+        </w:rPr>
+        <w:t>n:</w:t>
+      </w:r>
+      <w:r>
+        <w:rPr>
+          <w:sz w:val="19"/>
+          <w:bdr w:val="single" w:sz="2" w:space="3" w:color="BBBBBB"/>
+        </w:rPr>
+        <w:t xml:space="preserve"> 4</w:t>
+      </w:r>
+    </w:p>
+    <w:p>
+      <w:pPr>
+        <w:pStyle w:val="BodyText"/>
+        <w:keepLines/>
+        <w:bidi w:val="0"/>
+        <w:spacing w:before="20" w:after="20"/>
+        <w:ind w:hanging="0" w:left="160" w:right="160"/>
+        <w:jc w:val="left"/>
+        <w:rPr>
+          <w:sz w:val="19"/>
+          <w:bdr w:val="single" w:sz="2" w:space="3" w:color="BBBBBB"/>
+        </w:rPr>
+      </w:pPr>
+      <w:r>
+        <w:rPr>
+          <w:b/>
+          <w:color w:val="444444"/>
+          <w:sz w:val="19"/>
+          <w:bdr w:val="single" w:sz="2" w:space="3" w:color="BBBBBB"/>
+        </w:rPr>
+        <w:t>Who:</w:t>
+      </w:r>
+      <w:r>
+        <w:rPr>
+          <w:sz w:val="19"/>
+          <w:bdr w:val="single" w:sz="2" w:space="3" w:color="BBBBBB"/>
+        </w:rPr>
+        <w:t xml:space="preserve"> Ema, Vida, Procode, Crosby</w:t>
+      </w:r>
+    </w:p>
+    <w:p>
+      <w:pPr>
+        <w:pStyle w:val="BodyText"/>
+        <w:keepLines/>
+        <w:bidi w:val="0"/>
+        <w:spacing w:before="60" w:after="60"/>
+        <w:ind w:hanging="0" w:left="140" w:right="140"/>
+        <w:jc w:val="left"/>
+        <w:rPr>
+          <w:b/>
+          <w:bdr w:val="single" w:sz="2" w:space="3" w:color="BBBBBB"/>
+        </w:rPr>
+      </w:pPr>
+      <w:r>
+        <w:rPr>
+          <w:b/>
+          <w:bdr w:val="single" w:sz="2" w:space="3" w:color="BBBBBB"/>
+        </w:rPr>
+        <w:t>Per transaction, task, conversation or run</w:t>
+      </w:r>
+    </w:p>
+    <w:p>
+      <w:pPr>
+        <w:pStyle w:val="BodyText"/>
+        <w:keepLines/>
+        <w:bidi w:val="0"/>
+        <w:spacing w:before="20" w:after="20"/>
+        <w:ind w:hanging="0" w:left="160" w:right="160"/>
+        <w:jc w:val="left"/>
+        <w:rPr>
+          <w:sz w:val="19"/>
+          <w:bdr w:val="single" w:sz="2" w:space="3" w:color="BBBBBB"/>
+        </w:rPr>
+      </w:pPr>
+      <w:r>
+        <w:rPr>
+          <w:b/>
+          <w:color w:val="444444"/>
+          <w:sz w:val="19"/>
+          <w:bdr w:val="single" w:sz="2" w:space="3" w:color="BBBBBB"/>
+        </w:rPr>
+        <w:t>n:</w:t>
+      </w:r>
+      <w:r>
+        <w:rPr>
+          <w:sz w:val="19"/>
+          <w:bdr w:val="single" w:sz="2" w:space="3" w:color="BBBBBB"/>
+        </w:rPr>
+        <w:t xml:space="preserve"> 5</w:t>
+      </w:r>
+    </w:p>
+    <w:p>
+      <w:pPr>
+        <w:pStyle w:val="BodyText"/>
+        <w:keepLines/>
+        <w:bidi w:val="0"/>
+        <w:spacing w:before="20" w:after="20"/>
+        <w:ind w:hanging="0" w:left="160" w:right="160"/>
+        <w:jc w:val="left"/>
+        <w:rPr>
+          <w:sz w:val="19"/>
+          <w:bdr w:val="single" w:sz="2" w:space="3" w:color="BBBBBB"/>
+        </w:rPr>
+      </w:pPr>
+      <w:r>
+        <w:rPr>
+          <w:b/>
+          <w:color w:val="444444"/>
+          <w:sz w:val="19"/>
+          <w:bdr w:val="single" w:sz="2" w:space="3" w:color="BBBBBB"/>
+        </w:rPr>
+        <w:t>Who:</w:t>
+      </w:r>
+      <w:r>
+        <w:rPr>
+          <w:sz w:val="19"/>
+          <w:bdr w:val="single" w:sz="2" w:space="3" w:color="BBBBBB"/>
+        </w:rPr>
+        <w:t xml:space="preserve"> Duvo, DeepOpinion, Sierra, Decagon, Crescendo</w:t>
+      </w:r>
+    </w:p>
+    <w:p>
+      <w:pPr>
+        <w:pStyle w:val="BodyText"/>
+        <w:keepLines/>
+        <w:bidi w:val="0"/>
+        <w:spacing w:before="60" w:after="60"/>
+        <w:ind w:hanging="0" w:left="140" w:right="140"/>
+        <w:jc w:val="left"/>
+        <w:rPr>
+          <w:b/>
+          <w:bdr w:val="single" w:sz="2" w:space="3" w:color="BBBBBB"/>
+        </w:rPr>
+      </w:pPr>
+      <w:r>
+        <w:rPr>
+          <w:b/>
+          <w:bdr w:val="single" w:sz="2" w:space="3" w:color="BBBBBB"/>
+        </w:rPr>
+        <w:t>Hybrid (part outcome, part usage)</w:t>
+      </w:r>
+    </w:p>
+    <w:p>
+      <w:pPr>
+        <w:pStyle w:val="BodyText"/>
+        <w:keepLines/>
+        <w:bidi w:val="0"/>
+        <w:spacing w:before="20" w:after="20"/>
+        <w:ind w:hanging="0" w:left="160" w:right="160"/>
+        <w:jc w:val="left"/>
+        <w:rPr>
+          <w:sz w:val="19"/>
+          <w:bdr w:val="single" w:sz="2" w:space="3" w:color="BBBBBB"/>
+        </w:rPr>
+      </w:pPr>
+      <w:r>
+        <w:rPr>
+          <w:b/>
+          <w:color w:val="444444"/>
+          <w:sz w:val="19"/>
+          <w:bdr w:val="single" w:sz="2" w:space="3" w:color="BBBBBB"/>
+        </w:rPr>
+        <w:t>n:</w:t>
+      </w:r>
+      <w:r>
+        <w:rPr>
+          <w:sz w:val="19"/>
+          <w:bdr w:val="single" w:sz="2" w:space="3" w:color="BBBBBB"/>
+        </w:rPr>
+        <w:t xml:space="preserve"> 1</w:t>
+      </w:r>
+    </w:p>
+    <w:p>
+      <w:pPr>
+        <w:pStyle w:val="BodyText"/>
+        <w:keepLines/>
+        <w:bidi w:val="0"/>
+        <w:spacing w:before="20" w:after="20"/>
+        <w:ind w:hanging="0" w:left="160" w:right="160"/>
+        <w:jc w:val="left"/>
+        <w:rPr>
+          <w:sz w:val="19"/>
+          <w:bdr w:val="single" w:sz="2" w:space="3" w:color="BBBBBB"/>
+        </w:rPr>
+      </w:pPr>
+      <w:r>
+        <w:rPr>
+          <w:b/>
+          <w:color w:val="444444"/>
+          <w:sz w:val="19"/>
+          <w:bdr w:val="single" w:sz="2" w:space="3" w:color="BBBBBB"/>
+        </w:rPr>
+        <w:t>Who:</w:t>
+      </w:r>
+      <w:r>
+        <w:rPr>
+          <w:sz w:val="19"/>
+          <w:bdr w:val="single" w:sz="2" w:space="3" w:color="BBBBBB"/>
+        </w:rPr>
+        <w:t xml:space="preserve"> Prosper AI</w:t>
+      </w:r>
+    </w:p>
+    <w:p>
+      <w:pPr>
+        <w:pStyle w:val="BodyText"/>
+        <w:keepLines/>
+        <w:bidi w:val="0"/>
+        <w:spacing w:before="60" w:after="60"/>
+        <w:ind w:hanging="0" w:left="140" w:right="140"/>
+        <w:jc w:val="left"/>
+        <w:rPr>
+          <w:b/>
+          <w:bdr w:val="single" w:sz="2" w:space="3" w:color="BBBBBB"/>
+        </w:rPr>
+      </w:pPr>
+      <w:r>
+        <w:rPr>
+          <w:b/>
+          <w:bdr w:val="single" w:sz="2" w:space="3" w:color="BBBBBB"/>
+        </w:rPr>
+        <w:t>Usage (minutes, GB, cloud consumption)</w:t>
+      </w:r>
+    </w:p>
+    <w:p>
+      <w:pPr>
+        <w:pStyle w:val="BodyText"/>
+        <w:keepLines/>
+        <w:bidi w:val="0"/>
+        <w:spacing w:before="20" w:after="20"/>
+        <w:ind w:hanging="0" w:left="160" w:right="160"/>
+        <w:jc w:val="left"/>
+        <w:rPr>
+          <w:sz w:val="19"/>
+          <w:bdr w:val="single" w:sz="2" w:space="3" w:color="BBBBBB"/>
+        </w:rPr>
+      </w:pPr>
+      <w:r>
+        <w:rPr>
+          <w:b/>
+          <w:color w:val="444444"/>
+          <w:sz w:val="19"/>
+          <w:bdr w:val="single" w:sz="2" w:space="3" w:color="BBBBBB"/>
+        </w:rPr>
+        <w:t>n:</w:t>
+      </w:r>
+      <w:r>
+        <w:rPr>
+          <w:sz w:val="19"/>
+          <w:bdr w:val="single" w:sz="2" w:space="3" w:color="BBBBBB"/>
+        </w:rPr>
+        <w:t xml:space="preserve"> 3</w:t>
+      </w:r>
+    </w:p>
+    <w:p>
+      <w:pPr>
+        <w:pStyle w:val="BodyText"/>
+        <w:keepLines/>
+        <w:bidi w:val="0"/>
+        <w:spacing w:before="20" w:after="20"/>
+        <w:ind w:hanging="0" w:left="160" w:right="160"/>
+        <w:jc w:val="left"/>
+        <w:rPr>
+          <w:sz w:val="19"/>
+          <w:bdr w:val="single" w:sz="2" w:space="3" w:color="BBBBBB"/>
+        </w:rPr>
+      </w:pPr>
+      <w:r>
+        <w:rPr>
+          <w:b/>
+          <w:color w:val="444444"/>
+          <w:sz w:val="19"/>
+          <w:bdr w:val="single" w:sz="2" w:space="3" w:color="BBBBBB"/>
+        </w:rPr>
+        <w:t>Who:</w:t>
+      </w:r>
+      <w:r>
+        <w:rPr>
+          <w:sz w:val="19"/>
+          <w:bdr w:val="single" w:sz="2" w:space="3" w:color="BBBBBB"/>
+        </w:rPr>
+        <w:t xml:space="preserve"> Tsuga, Kestra, Cresta</w:t>
+      </w:r>
+    </w:p>
+    <w:p>
+      <w:pPr>
+        <w:pStyle w:val="BodyText"/>
+        <w:keepLines/>
+        <w:bidi w:val="0"/>
+        <w:spacing w:before="60" w:after="60"/>
+        <w:ind w:hanging="0" w:left="140" w:right="140"/>
+        <w:jc w:val="left"/>
+        <w:rPr>
+          <w:b/>
+          <w:bdr w:val="single" w:sz="2" w:space="3" w:color="BBBBBB"/>
+        </w:rPr>
+      </w:pPr>
+      <w:r>
+        <w:rPr>
+          <w:b/>
+          <w:bdr w:val="single" w:sz="2" w:space="3" w:color="BBBBBB"/>
+        </w:rPr>
+        <w:t>Subscription or seat</w:t>
+      </w:r>
+    </w:p>
+    <w:p>
+      <w:pPr>
+        <w:pStyle w:val="BodyText"/>
+        <w:keepLines/>
+        <w:bidi w:val="0"/>
+        <w:spacing w:before="20" w:after="20"/>
+        <w:ind w:hanging="0" w:left="160" w:right="160"/>
+        <w:jc w:val="left"/>
+        <w:rPr>
+          <w:sz w:val="19"/>
+          <w:bdr w:val="single" w:sz="2" w:space="3" w:color="BBBBBB"/>
+        </w:rPr>
+      </w:pPr>
+      <w:r>
+        <w:rPr>
+          <w:b/>
+          <w:color w:val="444444"/>
+          <w:sz w:val="19"/>
+          <w:bdr w:val="single" w:sz="2" w:space="3" w:color="BBBBBB"/>
+        </w:rPr>
+        <w:t>n:</w:t>
+      </w:r>
+      <w:r>
+        <w:rPr>
+          <w:sz w:val="19"/>
+          <w:bdr w:val="single" w:sz="2" w:space="3" w:color="BBBBBB"/>
+        </w:rPr>
+        <w:t xml:space="preserve"> 1</w:t>
+      </w:r>
+    </w:p>
+    <w:p>
+      <w:pPr>
+        <w:pStyle w:val="BodyText"/>
+        <w:keepLines/>
+        <w:bidi w:val="0"/>
+        <w:spacing w:before="20" w:after="20"/>
+        <w:ind w:hanging="0" w:left="160" w:right="160"/>
+        <w:jc w:val="left"/>
+        <w:rPr>
+          <w:sz w:val="19"/>
+          <w:bdr w:val="single" w:sz="2" w:space="3" w:color="BBBBBB"/>
+        </w:rPr>
+      </w:pPr>
+      <w:r>
+        <w:rPr>
+          <w:b/>
+          <w:color w:val="444444"/>
+          <w:sz w:val="19"/>
+          <w:bdr w:val="single" w:sz="2" w:space="3" w:color="BBBBBB"/>
+        </w:rPr>
+        <w:t>Who:</w:t>
+      </w:r>
+      <w:r>
+        <w:rPr>
+          <w:sz w:val="19"/>
+          <w:bdr w:val="single" w:sz="2" w:space="3" w:color="BBBBBB"/>
+        </w:rPr>
+        <w:t xml:space="preserve"> RapidCanvas</w:t>
+      </w:r>
+    </w:p>
+    <w:p>
+      <w:pPr>
+        <w:pStyle w:val="BodyText"/>
+        <w:keepLines/>
+        <w:bidi w:val="0"/>
+        <w:spacing w:before="60" w:after="60"/>
+        <w:ind w:hanging="0" w:left="140" w:right="140"/>
+        <w:jc w:val="left"/>
+        <w:rPr>
+          <w:b/>
+          <w:bdr w:val="single" w:sz="2" w:space="3" w:color="BBBBBB"/>
+        </w:rPr>
+      </w:pPr>
+      <w:r>
+        <w:rPr>
+          <w:b/>
+          <w:bdr w:val="single" w:sz="2" w:space="3" w:color="BBBBBB"/>
+        </w:rPr>
+        <w:t>Not disclosed in any filed source</w:t>
+      </w:r>
+    </w:p>
+    <w:p>
+      <w:pPr>
+        <w:pStyle w:val="BodyText"/>
+        <w:keepLines/>
+        <w:bidi w:val="0"/>
+        <w:spacing w:before="20" w:after="20"/>
+        <w:ind w:hanging="0" w:left="160" w:right="160"/>
+        <w:jc w:val="left"/>
+        <w:rPr>
+          <w:sz w:val="19"/>
+          <w:bdr w:val="single" w:sz="2" w:space="3" w:color="BBBBBB"/>
+        </w:rPr>
+      </w:pPr>
+      <w:r>
+        <w:rPr>
+          <w:b/>
+          <w:color w:val="444444"/>
+          <w:sz w:val="19"/>
+          <w:bdr w:val="single" w:sz="2" w:space="3" w:color="BBBBBB"/>
+        </w:rPr>
+        <w:t>n:</w:t>
+      </w:r>
+      <w:r>
+        <w:rPr>
+          <w:sz w:val="19"/>
+          <w:bdr w:val="single" w:sz="2" w:space="3" w:color="BBBBBB"/>
+        </w:rPr>
+        <w:t xml:space="preserve"> 51</w:t>
+      </w:r>
+    </w:p>
+    <w:p>
+      <w:pPr>
+        <w:pStyle w:val="BodyText"/>
+        <w:keepLines/>
+        <w:bidi w:val="0"/>
+        <w:spacing w:before="20" w:after="20"/>
+        <w:ind w:hanging="0" w:left="160" w:right="160"/>
+        <w:jc w:val="left"/>
+        <w:rPr>
+          <w:sz w:val="19"/>
+          <w:bdr w:val="single" w:sz="2" w:space="3" w:color="BBBBBB"/>
+        </w:rPr>
+      </w:pPr>
+      <w:r>
+        <w:rPr>
+          <w:b/>
+          <w:color w:val="444444"/>
+          <w:sz w:val="19"/>
+          <w:bdr w:val="single" w:sz="2" w:space="3" w:color="BBBBBB"/>
+        </w:rPr>
+        <w:t>Who:</w:t>
+      </w:r>
+      <w:r>
+        <w:rPr>
+          <w:sz w:val="19"/>
+          <w:bdr w:val="single" w:sz="2" w:space="3" w:color="BBBBBB"/>
+        </w:rPr>
+        <w:t xml:space="preserve"> CopilotKit, Coval, Dash0, Daytona, Flexprice, InsightFinder, Natural, Raindrop, Rein, Runlayer, LangChain, ElevenLabs, Sycamore, Airia, Maisa AI, Mimica, Skan AI, Workfabric AI, Actively AI, Attention, Omilia, respond.io, Moveworks, Adaptive, Basis, Definite, Elimentary, Xelix, Zolvo, Zomma, Didero, Lio, Magentic, Walter, Pactum, Pavus AI, Adonis, Amperos Health, Candid Health, GenHealth.ai, ClearRisk AI, Notch, Pace, Otera, Ivo, Wordsmith, Orbio, Spott, Take2, NeuBird AI, AuxoAI</w:t>
+      </w:r>
+    </w:p>
+    <w:p>
+      <w:pPr>
+        <w:pStyle w:val="BodyText"/>
+        <w:bidi w:val="0"/>
+        <w:jc w:val="left"/>
+        <w:rPr/>
+      </w:pPr>
+      <w:r>
+        <w:rPr>
+          <w:rStyle w:val="Strong"/>
+        </w:rPr>
+        <w:t>What this means:</w:t>
+      </w:r>
+      <w:r>
+        <w:rPr/>
+        <w:t xml:space="preserve"> buyer-verified prices are per transaction; true outcome pricing is only claimed, by four startups.</w:t>
+      </w:r>
+    </w:p>
+    <w:p>
+      <w:pPr>
+        <w:pStyle w:val="Heading3"/>
+        <w:bidi w:val="0"/>
+        <w:jc w:val="left"/>
+        <w:rPr/>
+      </w:pPr>
+      <w:r>
+        <w:rPr/>
+        <w:t>8.4 Go-to-market channel</w:t>
+      </w:r>
+    </w:p>
+    <w:p>
+      <w:pPr>
+        <w:pStyle w:val="BodyText"/>
+        <w:keepLines/>
+        <w:bidi w:val="0"/>
+        <w:spacing w:before="60" w:after="60"/>
+        <w:ind w:hanging="0" w:left="140" w:right="140"/>
+        <w:jc w:val="left"/>
+        <w:rPr>
+          <w:b/>
+          <w:bdr w:val="single" w:sz="2" w:space="3" w:color="BBBBBB"/>
+        </w:rPr>
+      </w:pPr>
+      <w:r>
+        <w:rPr>
+          <w:b/>
+          <w:bdr w:val="single" w:sz="2" w:space="3" w:color="BBBBBB"/>
+        </w:rPr>
+        <w:t>Direct to the enterprise (no partner named in sources)</w:t>
+      </w:r>
+    </w:p>
+    <w:p>
+      <w:pPr>
+        <w:pStyle w:val="BodyText"/>
+        <w:keepLines/>
+        <w:bidi w:val="0"/>
+        <w:spacing w:before="20" w:after="20"/>
+        <w:ind w:hanging="0" w:left="160" w:right="160"/>
+        <w:jc w:val="left"/>
+        <w:rPr>
+          <w:sz w:val="19"/>
+          <w:bdr w:val="single" w:sz="2" w:space="3" w:color="BBBBBB"/>
+        </w:rPr>
+      </w:pPr>
+      <w:r>
+        <w:rPr>
+          <w:b/>
+          <w:color w:val="444444"/>
+          <w:sz w:val="19"/>
+          <w:bdr w:val="single" w:sz="2" w:space="3" w:color="BBBBBB"/>
+        </w:rPr>
+        <w:t>n:</w:t>
+      </w:r>
+      <w:r>
+        <w:rPr>
+          <w:sz w:val="19"/>
+          <w:bdr w:val="single" w:sz="2" w:space="3" w:color="BBBBBB"/>
+        </w:rPr>
+        <w:t xml:space="preserve"> 45</w:t>
+      </w:r>
+    </w:p>
+    <w:p>
+      <w:pPr>
+        <w:pStyle w:val="BodyText"/>
+        <w:keepLines/>
+        <w:bidi w:val="0"/>
+        <w:spacing w:before="20" w:after="20"/>
+        <w:ind w:hanging="0" w:left="160" w:right="160"/>
+        <w:jc w:val="left"/>
+        <w:rPr>
+          <w:sz w:val="19"/>
+          <w:bdr w:val="single" w:sz="2" w:space="3" w:color="BBBBBB"/>
+        </w:rPr>
+      </w:pPr>
+      <w:r>
+        <w:rPr>
+          <w:b/>
+          <w:color w:val="444444"/>
+          <w:sz w:val="19"/>
+          <w:bdr w:val="single" w:sz="2" w:space="3" w:color="BBBBBB"/>
+        </w:rPr>
+        <w:t>Who:</w:t>
+      </w:r>
+      <w:r>
+        <w:rPr>
+          <w:sz w:val="19"/>
+          <w:bdr w:val="single" w:sz="2" w:space="3" w:color="BBBBBB"/>
+        </w:rPr>
+        <w:t xml:space="preserve"> Coval, Dash0, Daytona, InsightFinder, Natural, Raindrop, Rein, Runlayer, Tsuga, ElevenLabs, Ema, Duvo, Sycamore, Airia, Maisa AI, Mimica, Skan AI, Actively AI, Attention, Sierra, Decagon, Omilia, respond.io, Cresta, Adaptive, Basis, Definite, Elimentary, Xelix, Zolvo, Zomma, Lio, Pactum, Pavus AI, Adonis, Amperos Health, Candid Health, ClearRisk AI, Notch, Ivo, Wordsmith, Orbio, Spott, Take2, NeuBird AI</w:t>
+      </w:r>
+    </w:p>
+    <w:p>
+      <w:pPr>
+        <w:pStyle w:val="BodyText"/>
+        <w:keepLines/>
+        <w:bidi w:val="0"/>
+        <w:spacing w:before="60" w:after="60"/>
+        <w:ind w:hanging="0" w:left="140" w:right="140"/>
+        <w:jc w:val="left"/>
+        <w:rPr>
+          <w:b/>
+          <w:bdr w:val="single" w:sz="2" w:space="3" w:color="BBBBBB"/>
+        </w:rPr>
+      </w:pPr>
+      <w:r>
+        <w:rPr>
+          <w:b/>
+          <w:bdr w:val="single" w:sz="2" w:space="3" w:color="BBBBBB"/>
+        </w:rPr>
+        <w:t>Runs inside or on top of a system of record (SAP, Oracle, ServiceNow, existing EHR or email)</w:t>
+      </w:r>
+    </w:p>
+    <w:p>
+      <w:pPr>
+        <w:pStyle w:val="BodyText"/>
+        <w:keepLines/>
+        <w:bidi w:val="0"/>
+        <w:spacing w:before="20" w:after="20"/>
+        <w:ind w:hanging="0" w:left="160" w:right="160"/>
+        <w:jc w:val="left"/>
+        <w:rPr>
+          <w:sz w:val="19"/>
+          <w:bdr w:val="single" w:sz="2" w:space="3" w:color="BBBBBB"/>
+        </w:rPr>
+      </w:pPr>
+      <w:r>
+        <w:rPr>
+          <w:b/>
+          <w:color w:val="444444"/>
+          <w:sz w:val="19"/>
+          <w:bdr w:val="single" w:sz="2" w:space="3" w:color="BBBBBB"/>
+        </w:rPr>
+        <w:t>n:</w:t>
+      </w:r>
+      <w:r>
+        <w:rPr>
+          <w:sz w:val="19"/>
+          <w:bdr w:val="single" w:sz="2" w:space="3" w:color="BBBBBB"/>
+        </w:rPr>
+        <w:t xml:space="preserve"> 5</w:t>
+      </w:r>
+    </w:p>
+    <w:p>
+      <w:pPr>
+        <w:pStyle w:val="BodyText"/>
+        <w:keepLines/>
+        <w:bidi w:val="0"/>
+        <w:spacing w:before="20" w:after="20"/>
+        <w:ind w:hanging="0" w:left="160" w:right="160"/>
+        <w:jc w:val="left"/>
+        <w:rPr>
+          <w:sz w:val="19"/>
+          <w:bdr w:val="single" w:sz="2" w:space="3" w:color="BBBBBB"/>
+        </w:rPr>
+      </w:pPr>
+      <w:r>
+        <w:rPr>
+          <w:b/>
+          <w:color w:val="444444"/>
+          <w:sz w:val="19"/>
+          <w:bdr w:val="single" w:sz="2" w:space="3" w:color="BBBBBB"/>
+        </w:rPr>
+        <w:t>Who:</w:t>
+      </w:r>
+      <w:r>
+        <w:rPr>
+          <w:sz w:val="19"/>
+          <w:bdr w:val="single" w:sz="2" w:space="3" w:color="BBBBBB"/>
+        </w:rPr>
+        <w:t xml:space="preserve"> Moveworks, Didero, Magentic, Walter, GenHealth.ai</w:t>
+      </w:r>
+    </w:p>
+    <w:p>
+      <w:pPr>
+        <w:pStyle w:val="BodyText"/>
+        <w:keepLines/>
+        <w:bidi w:val="0"/>
+        <w:spacing w:before="60" w:after="60"/>
+        <w:ind w:hanging="0" w:left="140" w:right="140"/>
+        <w:jc w:val="left"/>
+        <w:rPr>
+          <w:b/>
+          <w:bdr w:val="single" w:sz="2" w:space="3" w:color="BBBBBB"/>
+        </w:rPr>
+      </w:pPr>
+      <w:r>
+        <w:rPr>
+          <w:b/>
+          <w:bdr w:val="single" w:sz="2" w:space="3" w:color="BBBBBB"/>
+        </w:rPr>
+        <w:t>Sold or delivered through an SI, BPO or channel partner</w:t>
+      </w:r>
+    </w:p>
+    <w:p>
+      <w:pPr>
+        <w:pStyle w:val="BodyText"/>
+        <w:keepLines/>
+        <w:bidi w:val="0"/>
+        <w:spacing w:before="20" w:after="20"/>
+        <w:ind w:hanging="0" w:left="160" w:right="160"/>
+        <w:jc w:val="left"/>
+        <w:rPr>
+          <w:sz w:val="19"/>
+          <w:bdr w:val="single" w:sz="2" w:space="3" w:color="BBBBBB"/>
+        </w:rPr>
+      </w:pPr>
+      <w:r>
+        <w:rPr>
+          <w:b/>
+          <w:color w:val="444444"/>
+          <w:sz w:val="19"/>
+          <w:bdr w:val="single" w:sz="2" w:space="3" w:color="BBBBBB"/>
+        </w:rPr>
+        <w:t>n:</w:t>
+      </w:r>
+      <w:r>
+        <w:rPr>
+          <w:sz w:val="19"/>
+          <w:bdr w:val="single" w:sz="2" w:space="3" w:color="BBBBBB"/>
+        </w:rPr>
+        <w:t xml:space="preserve"> 4</w:t>
+      </w:r>
+    </w:p>
+    <w:p>
+      <w:pPr>
+        <w:pStyle w:val="BodyText"/>
+        <w:keepLines/>
+        <w:bidi w:val="0"/>
+        <w:spacing w:before="20" w:after="20"/>
+        <w:ind w:hanging="0" w:left="160" w:right="160"/>
+        <w:jc w:val="left"/>
+        <w:rPr>
+          <w:sz w:val="19"/>
+          <w:bdr w:val="single" w:sz="2" w:space="3" w:color="BBBBBB"/>
+        </w:rPr>
+      </w:pPr>
+      <w:r>
+        <w:rPr>
+          <w:b/>
+          <w:color w:val="444444"/>
+          <w:sz w:val="19"/>
+          <w:bdr w:val="single" w:sz="2" w:space="3" w:color="BBBBBB"/>
+        </w:rPr>
+        <w:t>Who:</w:t>
+      </w:r>
+      <w:r>
+        <w:rPr>
+          <w:sz w:val="19"/>
+          <w:bdr w:val="single" w:sz="2" w:space="3" w:color="BBBBBB"/>
+        </w:rPr>
+        <w:t xml:space="preserve"> DeepOpinion, Workfabric AI, Vida, Otera</w:t>
+      </w:r>
+    </w:p>
+    <w:p>
+      <w:pPr>
+        <w:pStyle w:val="BodyText"/>
+        <w:keepLines/>
+        <w:bidi w:val="0"/>
+        <w:spacing w:before="60" w:after="60"/>
+        <w:ind w:hanging="0" w:left="140" w:right="140"/>
+        <w:jc w:val="left"/>
+        <w:rPr>
+          <w:b/>
+          <w:bdr w:val="single" w:sz="2" w:space="3" w:color="BBBBBB"/>
+        </w:rPr>
+      </w:pPr>
+      <w:r>
+        <w:rPr>
+          <w:b/>
+          <w:bdr w:val="single" w:sz="2" w:space="3" w:color="BBBBBB"/>
+        </w:rPr>
+        <w:t>Sells the finished work (AI-native service firm or BPO replacement)</w:t>
+      </w:r>
+    </w:p>
+    <w:p>
+      <w:pPr>
+        <w:pStyle w:val="BodyText"/>
+        <w:keepLines/>
+        <w:bidi w:val="0"/>
+        <w:spacing w:before="20" w:after="20"/>
+        <w:ind w:hanging="0" w:left="160" w:right="160"/>
+        <w:jc w:val="left"/>
+        <w:rPr>
+          <w:sz w:val="19"/>
+          <w:bdr w:val="single" w:sz="2" w:space="3" w:color="BBBBBB"/>
+        </w:rPr>
+      </w:pPr>
+      <w:r>
+        <w:rPr>
+          <w:b/>
+          <w:color w:val="444444"/>
+          <w:sz w:val="19"/>
+          <w:bdr w:val="single" w:sz="2" w:space="3" w:color="BBBBBB"/>
+        </w:rPr>
+        <w:t>n:</w:t>
+      </w:r>
+      <w:r>
+        <w:rPr>
+          <w:sz w:val="19"/>
+          <w:bdr w:val="single" w:sz="2" w:space="3" w:color="BBBBBB"/>
+        </w:rPr>
+        <w:t xml:space="preserve"> 7</w:t>
+      </w:r>
+    </w:p>
+    <w:p>
+      <w:pPr>
+        <w:pStyle w:val="BodyText"/>
+        <w:keepLines/>
+        <w:bidi w:val="0"/>
+        <w:spacing w:before="20" w:after="20"/>
+        <w:ind w:hanging="0" w:left="160" w:right="160"/>
+        <w:jc w:val="left"/>
+        <w:rPr>
+          <w:sz w:val="19"/>
+          <w:bdr w:val="single" w:sz="2" w:space="3" w:color="BBBBBB"/>
+        </w:rPr>
+      </w:pPr>
+      <w:r>
+        <w:rPr>
+          <w:b/>
+          <w:color w:val="444444"/>
+          <w:sz w:val="19"/>
+          <w:bdr w:val="single" w:sz="2" w:space="3" w:color="BBBBBB"/>
+        </w:rPr>
+        <w:t>Who:</w:t>
+      </w:r>
+      <w:r>
+        <w:rPr>
+          <w:sz w:val="19"/>
+          <w:bdr w:val="single" w:sz="2" w:space="3" w:color="BBBBBB"/>
+        </w:rPr>
+        <w:t xml:space="preserve"> Procode, Prosper AI, Pace, Crosby, Crescendo, RapidCanvas, AuxoAI</w:t>
+      </w:r>
+    </w:p>
+    <w:p>
+      <w:pPr>
+        <w:pStyle w:val="BodyText"/>
+        <w:keepLines/>
+        <w:bidi w:val="0"/>
+        <w:spacing w:before="60" w:after="60"/>
+        <w:ind w:hanging="0" w:left="140" w:right="140"/>
+        <w:jc w:val="left"/>
+        <w:rPr>
+          <w:b/>
+          <w:bdr w:val="single" w:sz="2" w:space="3" w:color="BBBBBB"/>
+        </w:rPr>
+      </w:pPr>
+      <w:r>
+        <w:rPr>
+          <w:b/>
+          <w:bdr w:val="single" w:sz="2" w:space="3" w:color="BBBBBB"/>
+        </w:rPr>
+        <w:t>Open source or developer-led</w:t>
+      </w:r>
+    </w:p>
+    <w:p>
+      <w:pPr>
+        <w:pStyle w:val="BodyText"/>
+        <w:keepLines/>
+        <w:bidi w:val="0"/>
+        <w:spacing w:before="20" w:after="20"/>
+        <w:ind w:hanging="0" w:left="160" w:right="160"/>
+        <w:jc w:val="left"/>
+        <w:rPr>
+          <w:sz w:val="19"/>
+          <w:bdr w:val="single" w:sz="2" w:space="3" w:color="BBBBBB"/>
+        </w:rPr>
+      </w:pPr>
+      <w:r>
+        <w:rPr>
+          <w:b/>
+          <w:color w:val="444444"/>
+          <w:sz w:val="19"/>
+          <w:bdr w:val="single" w:sz="2" w:space="3" w:color="BBBBBB"/>
+        </w:rPr>
+        <w:t>n:</w:t>
+      </w:r>
+      <w:r>
+        <w:rPr>
+          <w:sz w:val="19"/>
+          <w:bdr w:val="single" w:sz="2" w:space="3" w:color="BBBBBB"/>
+        </w:rPr>
+        <w:t xml:space="preserve"> 4</w:t>
+      </w:r>
+    </w:p>
+    <w:p>
+      <w:pPr>
+        <w:pStyle w:val="BodyText"/>
+        <w:keepLines/>
+        <w:bidi w:val="0"/>
+        <w:spacing w:before="20" w:after="20"/>
+        <w:ind w:hanging="0" w:left="160" w:right="160"/>
+        <w:jc w:val="left"/>
+        <w:rPr>
+          <w:sz w:val="19"/>
+          <w:bdr w:val="single" w:sz="2" w:space="3" w:color="BBBBBB"/>
+        </w:rPr>
+      </w:pPr>
+      <w:r>
+        <w:rPr>
+          <w:b/>
+          <w:color w:val="444444"/>
+          <w:sz w:val="19"/>
+          <w:bdr w:val="single" w:sz="2" w:space="3" w:color="BBBBBB"/>
+        </w:rPr>
+        <w:t>Who:</w:t>
+      </w:r>
+      <w:r>
+        <w:rPr>
+          <w:sz w:val="19"/>
+          <w:bdr w:val="single" w:sz="2" w:space="3" w:color="BBBBBB"/>
+        </w:rPr>
+        <w:t xml:space="preserve"> CopilotKit, Flexprice, LangChain, Kestra</w:t>
+      </w:r>
+    </w:p>
+    <w:p>
+      <w:pPr>
+        <w:pStyle w:val="BodyText"/>
+        <w:bidi w:val="0"/>
+        <w:jc w:val="left"/>
+        <w:rPr/>
+      </w:pPr>
+      <w:r>
+        <w:rPr>
+          <w:rStyle w:val="Strong"/>
+        </w:rPr>
+        <w:t>What this means:</w:t>
+      </w:r>
+      <w:r>
+        <w:rPr/>
+        <w:t xml:space="preserve"> direct sale dominates; all three SI-delivered startups run through Cognizant, so "SIs as channel" rests on one SI [src-20260724-b4a442] [src-20250627-297f7b] [src-20260710-e2a61b].</w:t>
+      </w:r>
+    </w:p>
+    <w:p>
+      <w:pPr>
+        <w:pStyle w:val="Heading3"/>
+        <w:bidi w:val="0"/>
+        <w:jc w:val="left"/>
+        <w:rPr/>
+      </w:pPr>
+      <w:r>
+        <w:rPr/>
+        <w:t>8.5 Stage</w:t>
+      </w:r>
+    </w:p>
+    <w:p>
+      <w:pPr>
+        <w:pStyle w:val="BodyText"/>
+        <w:keepLines/>
+        <w:bidi w:val="0"/>
+        <w:spacing w:before="60" w:after="60"/>
+        <w:ind w:hanging="0" w:left="140" w:right="140"/>
+        <w:jc w:val="left"/>
+        <w:rPr>
+          <w:b/>
+          <w:bdr w:val="single" w:sz="2" w:space="3" w:color="BBBBBB"/>
+        </w:rPr>
+      </w:pPr>
+      <w:r>
+        <w:rPr>
+          <w:b/>
+          <w:bdr w:val="single" w:sz="2" w:space="3" w:color="BBBBBB"/>
+        </w:rPr>
+        <w:t>Seed</w:t>
+      </w:r>
+    </w:p>
+    <w:p>
+      <w:pPr>
+        <w:pStyle w:val="BodyText"/>
+        <w:keepLines/>
+        <w:bidi w:val="0"/>
+        <w:spacing w:before="20" w:after="20"/>
+        <w:ind w:hanging="0" w:left="160" w:right="160"/>
+        <w:jc w:val="left"/>
+        <w:rPr>
+          <w:sz w:val="19"/>
+          <w:bdr w:val="single" w:sz="2" w:space="3" w:color="BBBBBB"/>
+        </w:rPr>
+      </w:pPr>
+      <w:r>
+        <w:rPr>
+          <w:b/>
+          <w:color w:val="444444"/>
+          <w:sz w:val="19"/>
+          <w:bdr w:val="single" w:sz="2" w:space="3" w:color="BBBBBB"/>
+        </w:rPr>
+        <w:t>n:</w:t>
+      </w:r>
+      <w:r>
+        <w:rPr>
+          <w:sz w:val="19"/>
+          <w:bdr w:val="single" w:sz="2" w:space="3" w:color="BBBBBB"/>
+        </w:rPr>
+        <w:t xml:space="preserve"> 7</w:t>
+      </w:r>
+    </w:p>
+    <w:p>
+      <w:pPr>
+        <w:pStyle w:val="BodyText"/>
+        <w:keepLines/>
+        <w:bidi w:val="0"/>
+        <w:spacing w:before="20" w:after="20"/>
+        <w:ind w:hanging="0" w:left="160" w:right="160"/>
+        <w:jc w:val="left"/>
+        <w:rPr>
+          <w:sz w:val="19"/>
+          <w:bdr w:val="single" w:sz="2" w:space="3" w:color="BBBBBB"/>
+        </w:rPr>
+      </w:pPr>
+      <w:r>
+        <w:rPr>
+          <w:b/>
+          <w:color w:val="444444"/>
+          <w:sz w:val="19"/>
+          <w:bdr w:val="single" w:sz="2" w:space="3" w:color="BBBBBB"/>
+        </w:rPr>
+        <w:t>Who:</w:t>
+      </w:r>
+      <w:r>
+        <w:rPr>
+          <w:sz w:val="19"/>
+          <w:bdr w:val="single" w:sz="2" w:space="3" w:color="BBBBBB"/>
+        </w:rPr>
+        <w:t xml:space="preserve"> Flexprice, Sycamore, Definite, Elimentary, Zolvo, Zomma, Walter</w:t>
+      </w:r>
+    </w:p>
+    <w:p>
+      <w:pPr>
+        <w:pStyle w:val="BodyText"/>
+        <w:keepLines/>
+        <w:bidi w:val="0"/>
+        <w:spacing w:before="60" w:after="60"/>
+        <w:ind w:hanging="0" w:left="140" w:right="140"/>
+        <w:jc w:val="left"/>
+        <w:rPr>
+          <w:b/>
+          <w:bdr w:val="single" w:sz="2" w:space="3" w:color="BBBBBB"/>
+        </w:rPr>
+      </w:pPr>
+      <w:r>
+        <w:rPr>
+          <w:b/>
+          <w:bdr w:val="single" w:sz="2" w:space="3" w:color="BBBBBB"/>
+        </w:rPr>
+        <w:t>Series A</w:t>
+      </w:r>
+    </w:p>
+    <w:p>
+      <w:pPr>
+        <w:pStyle w:val="BodyText"/>
+        <w:keepLines/>
+        <w:bidi w:val="0"/>
+        <w:spacing w:before="20" w:after="20"/>
+        <w:ind w:hanging="0" w:left="160" w:right="160"/>
+        <w:jc w:val="left"/>
+        <w:rPr>
+          <w:sz w:val="19"/>
+          <w:bdr w:val="single" w:sz="2" w:space="3" w:color="BBBBBB"/>
+        </w:rPr>
+      </w:pPr>
+      <w:r>
+        <w:rPr>
+          <w:b/>
+          <w:color w:val="444444"/>
+          <w:sz w:val="19"/>
+          <w:bdr w:val="single" w:sz="2" w:space="3" w:color="BBBBBB"/>
+        </w:rPr>
+        <w:t>n:</w:t>
+      </w:r>
+      <w:r>
+        <w:rPr>
+          <w:sz w:val="19"/>
+          <w:bdr w:val="single" w:sz="2" w:space="3" w:color="BBBBBB"/>
+        </w:rPr>
+        <w:t xml:space="preserve"> 22</w:t>
+      </w:r>
+    </w:p>
+    <w:p>
+      <w:pPr>
+        <w:pStyle w:val="BodyText"/>
+        <w:keepLines/>
+        <w:bidi w:val="0"/>
+        <w:spacing w:before="20" w:after="20"/>
+        <w:ind w:hanging="0" w:left="160" w:right="160"/>
+        <w:jc w:val="left"/>
+        <w:rPr>
+          <w:sz w:val="19"/>
+          <w:bdr w:val="single" w:sz="2" w:space="3" w:color="BBBBBB"/>
+        </w:rPr>
+      </w:pPr>
+      <w:r>
+        <w:rPr>
+          <w:b/>
+          <w:color w:val="444444"/>
+          <w:sz w:val="19"/>
+          <w:bdr w:val="single" w:sz="2" w:space="3" w:color="BBBBBB"/>
+        </w:rPr>
+        <w:t>Who:</w:t>
+      </w:r>
+      <w:r>
+        <w:rPr>
+          <w:sz w:val="19"/>
+          <w:bdr w:val="single" w:sz="2" w:space="3" w:color="BBBBBB"/>
+        </w:rPr>
+        <w:t xml:space="preserve"> CopilotKit, Coval, Natural, Raindrop, Rein, Runlayer, Tsuga, Kestra, Duvo, Didero, Lio, Magentic, Amperos Health, GenHealth.ai, Procode, ClearRisk AI, Notch, Otera, Orbio, Spott, Take2, AuxoAI</w:t>
+      </w:r>
+    </w:p>
+    <w:p>
+      <w:pPr>
+        <w:pStyle w:val="BodyText"/>
+        <w:keepLines/>
+        <w:bidi w:val="0"/>
+        <w:spacing w:before="60" w:after="60"/>
+        <w:ind w:hanging="0" w:left="140" w:right="140"/>
+        <w:jc w:val="left"/>
+        <w:rPr>
+          <w:b/>
+          <w:bdr w:val="single" w:sz="2" w:space="3" w:color="BBBBBB"/>
+        </w:rPr>
+      </w:pPr>
+      <w:r>
+        <w:rPr>
+          <w:b/>
+          <w:bdr w:val="single" w:sz="2" w:space="3" w:color="BBBBBB"/>
+        </w:rPr>
+        <w:t>Series B</w:t>
+      </w:r>
+    </w:p>
+    <w:p>
+      <w:pPr>
+        <w:pStyle w:val="BodyText"/>
+        <w:keepLines/>
+        <w:bidi w:val="0"/>
+        <w:spacing w:before="20" w:after="20"/>
+        <w:ind w:hanging="0" w:left="160" w:right="160"/>
+        <w:jc w:val="left"/>
+        <w:rPr>
+          <w:sz w:val="19"/>
+          <w:bdr w:val="single" w:sz="2" w:space="3" w:color="BBBBBB"/>
+        </w:rPr>
+      </w:pPr>
+      <w:r>
+        <w:rPr>
+          <w:b/>
+          <w:color w:val="444444"/>
+          <w:sz w:val="19"/>
+          <w:bdr w:val="single" w:sz="2" w:space="3" w:color="BBBBBB"/>
+        </w:rPr>
+        <w:t>n:</w:t>
+      </w:r>
+      <w:r>
+        <w:rPr>
+          <w:sz w:val="19"/>
+          <w:bdr w:val="single" w:sz="2" w:space="3" w:color="BBBBBB"/>
+        </w:rPr>
+        <w:t xml:space="preserve"> 18</w:t>
+      </w:r>
+    </w:p>
+    <w:p>
+      <w:pPr>
+        <w:pStyle w:val="BodyText"/>
+        <w:keepLines/>
+        <w:bidi w:val="0"/>
+        <w:spacing w:before="20" w:after="20"/>
+        <w:ind w:hanging="0" w:left="160" w:right="160"/>
+        <w:jc w:val="left"/>
+        <w:rPr>
+          <w:sz w:val="19"/>
+          <w:bdr w:val="single" w:sz="2" w:space="3" w:color="BBBBBB"/>
+        </w:rPr>
+      </w:pPr>
+      <w:r>
+        <w:rPr>
+          <w:b/>
+          <w:color w:val="444444"/>
+          <w:sz w:val="19"/>
+          <w:bdr w:val="single" w:sz="2" w:space="3" w:color="BBBBBB"/>
+        </w:rPr>
+        <w:t>Who:</w:t>
+      </w:r>
+      <w:r>
+        <w:rPr>
+          <w:sz w:val="19"/>
+          <w:bdr w:val="single" w:sz="2" w:space="3" w:color="BBBBBB"/>
+        </w:rPr>
+        <w:t xml:space="preserve"> Dash0, Daytona, InsightFinder, Ema, Mimica, Actively AI, Attention, Omilia, respond.io, Adaptive, Basis, Xelix, Pace, Crosby, Ivo, Wordsmith, NeuBird AI, RapidCanvas</w:t>
+      </w:r>
+    </w:p>
+    <w:p>
+      <w:pPr>
+        <w:pStyle w:val="BodyText"/>
+        <w:keepLines/>
+        <w:bidi w:val="0"/>
+        <w:spacing w:before="60" w:after="60"/>
+        <w:ind w:hanging="0" w:left="140" w:right="140"/>
+        <w:jc w:val="left"/>
+        <w:rPr>
+          <w:b/>
+          <w:bdr w:val="single" w:sz="2" w:space="3" w:color="BBBBBB"/>
+        </w:rPr>
+      </w:pPr>
+      <w:r>
+        <w:rPr>
+          <w:b/>
+          <w:bdr w:val="single" w:sz="2" w:space="3" w:color="BBBBBB"/>
+        </w:rPr>
+        <w:t>Series C</w:t>
+      </w:r>
+    </w:p>
+    <w:p>
+      <w:pPr>
+        <w:pStyle w:val="BodyText"/>
+        <w:keepLines/>
+        <w:bidi w:val="0"/>
+        <w:spacing w:before="20" w:after="20"/>
+        <w:ind w:hanging="0" w:left="160" w:right="160"/>
+        <w:jc w:val="left"/>
+        <w:rPr>
+          <w:sz w:val="19"/>
+          <w:bdr w:val="single" w:sz="2" w:space="3" w:color="BBBBBB"/>
+        </w:rPr>
+      </w:pPr>
+      <w:r>
+        <w:rPr>
+          <w:b/>
+          <w:color w:val="444444"/>
+          <w:sz w:val="19"/>
+          <w:bdr w:val="single" w:sz="2" w:space="3" w:color="BBBBBB"/>
+        </w:rPr>
+        <w:t>n:</w:t>
+      </w:r>
+      <w:r>
+        <w:rPr>
+          <w:sz w:val="19"/>
+          <w:bdr w:val="single" w:sz="2" w:space="3" w:color="BBBBBB"/>
+        </w:rPr>
+        <w:t xml:space="preserve"> 2</w:t>
+      </w:r>
+    </w:p>
+    <w:p>
+      <w:pPr>
+        <w:pStyle w:val="BodyText"/>
+        <w:keepLines/>
+        <w:bidi w:val="0"/>
+        <w:spacing w:before="20" w:after="20"/>
+        <w:ind w:hanging="0" w:left="160" w:right="160"/>
+        <w:jc w:val="left"/>
+        <w:rPr>
+          <w:sz w:val="19"/>
+          <w:bdr w:val="single" w:sz="2" w:space="3" w:color="BBBBBB"/>
+        </w:rPr>
+      </w:pPr>
+      <w:r>
+        <w:rPr>
+          <w:b/>
+          <w:color w:val="444444"/>
+          <w:sz w:val="19"/>
+          <w:bdr w:val="single" w:sz="2" w:space="3" w:color="BBBBBB"/>
+        </w:rPr>
+        <w:t>Who:</w:t>
+      </w:r>
+      <w:r>
+        <w:rPr>
+          <w:sz w:val="19"/>
+          <w:bdr w:val="single" w:sz="2" w:space="3" w:color="BBBBBB"/>
+        </w:rPr>
+        <w:t xml:space="preserve"> Skan AI, Adonis</w:t>
+      </w:r>
+    </w:p>
+    <w:p>
+      <w:pPr>
+        <w:pStyle w:val="BodyText"/>
+        <w:keepLines/>
+        <w:bidi w:val="0"/>
+        <w:spacing w:before="60" w:after="60"/>
+        <w:ind w:hanging="0" w:left="140" w:right="140"/>
+        <w:jc w:val="left"/>
+        <w:rPr>
+          <w:b/>
+          <w:bdr w:val="single" w:sz="2" w:space="3" w:color="BBBBBB"/>
+        </w:rPr>
+      </w:pPr>
+      <w:r>
+        <w:rPr>
+          <w:b/>
+          <w:bdr w:val="single" w:sz="2" w:space="3" w:color="BBBBBB"/>
+        </w:rPr>
+        <w:t>Series D or later / late private</w:t>
+      </w:r>
+    </w:p>
+    <w:p>
+      <w:pPr>
+        <w:pStyle w:val="BodyText"/>
+        <w:keepLines/>
+        <w:bidi w:val="0"/>
+        <w:spacing w:before="20" w:after="20"/>
+        <w:ind w:hanging="0" w:left="160" w:right="160"/>
+        <w:jc w:val="left"/>
+        <w:rPr>
+          <w:sz w:val="19"/>
+          <w:bdr w:val="single" w:sz="2" w:space="3" w:color="BBBBBB"/>
+        </w:rPr>
+      </w:pPr>
+      <w:r>
+        <w:rPr>
+          <w:b/>
+          <w:color w:val="444444"/>
+          <w:sz w:val="19"/>
+          <w:bdr w:val="single" w:sz="2" w:space="3" w:color="BBBBBB"/>
+        </w:rPr>
+        <w:t>n:</w:t>
+      </w:r>
+      <w:r>
+        <w:rPr>
+          <w:sz w:val="19"/>
+          <w:bdr w:val="single" w:sz="2" w:space="3" w:color="BBBBBB"/>
+        </w:rPr>
+        <w:t xml:space="preserve"> 2</w:t>
+      </w:r>
+    </w:p>
+    <w:p>
+      <w:pPr>
+        <w:pStyle w:val="BodyText"/>
+        <w:keepLines/>
+        <w:bidi w:val="0"/>
+        <w:spacing w:before="20" w:after="20"/>
+        <w:ind w:hanging="0" w:left="160" w:right="160"/>
+        <w:jc w:val="left"/>
+        <w:rPr>
+          <w:sz w:val="19"/>
+          <w:bdr w:val="single" w:sz="2" w:space="3" w:color="BBBBBB"/>
+        </w:rPr>
+      </w:pPr>
+      <w:r>
+        <w:rPr>
+          <w:b/>
+          <w:color w:val="444444"/>
+          <w:sz w:val="19"/>
+          <w:bdr w:val="single" w:sz="2" w:space="3" w:color="BBBBBB"/>
+        </w:rPr>
+        <w:t>Who:</w:t>
+      </w:r>
+      <w:r>
+        <w:rPr>
+          <w:sz w:val="19"/>
+          <w:bdr w:val="single" w:sz="2" w:space="3" w:color="BBBBBB"/>
+        </w:rPr>
+        <w:t xml:space="preserve"> Sierra, Candid Health</w:t>
+      </w:r>
+    </w:p>
+    <w:p>
+      <w:pPr>
+        <w:pStyle w:val="BodyText"/>
+        <w:keepLines/>
+        <w:bidi w:val="0"/>
+        <w:spacing w:before="60" w:after="60"/>
+        <w:ind w:hanging="0" w:left="140" w:right="140"/>
+        <w:jc w:val="left"/>
+        <w:rPr>
+          <w:b/>
+          <w:bdr w:val="single" w:sz="2" w:space="3" w:color="BBBBBB"/>
+        </w:rPr>
+      </w:pPr>
+      <w:r>
+        <w:rPr>
+          <w:b/>
+          <w:bdr w:val="single" w:sz="2" w:space="3" w:color="BBBBBB"/>
+        </w:rPr>
+        <w:t>Stage not in filed sources</w:t>
+      </w:r>
+    </w:p>
+    <w:p>
+      <w:pPr>
+        <w:pStyle w:val="BodyText"/>
+        <w:keepLines/>
+        <w:bidi w:val="0"/>
+        <w:spacing w:before="20" w:after="20"/>
+        <w:ind w:hanging="0" w:left="160" w:right="160"/>
+        <w:jc w:val="left"/>
+        <w:rPr>
+          <w:sz w:val="19"/>
+          <w:bdr w:val="single" w:sz="2" w:space="3" w:color="BBBBBB"/>
+        </w:rPr>
+      </w:pPr>
+      <w:r>
+        <w:rPr>
+          <w:b/>
+          <w:color w:val="444444"/>
+          <w:sz w:val="19"/>
+          <w:bdr w:val="single" w:sz="2" w:space="3" w:color="BBBBBB"/>
+        </w:rPr>
+        <w:t>n:</w:t>
+      </w:r>
+      <w:r>
+        <w:rPr>
+          <w:sz w:val="19"/>
+          <w:bdr w:val="single" w:sz="2" w:space="3" w:color="BBBBBB"/>
+        </w:rPr>
+        <w:t xml:space="preserve"> 14</w:t>
+      </w:r>
+    </w:p>
+    <w:p>
+      <w:pPr>
+        <w:pStyle w:val="BodyText"/>
+        <w:keepLines/>
+        <w:bidi w:val="0"/>
+        <w:spacing w:before="20" w:after="20"/>
+        <w:ind w:hanging="0" w:left="160" w:right="160"/>
+        <w:jc w:val="left"/>
+        <w:rPr>
+          <w:sz w:val="19"/>
+          <w:bdr w:val="single" w:sz="2" w:space="3" w:color="BBBBBB"/>
+        </w:rPr>
+      </w:pPr>
+      <w:r>
+        <w:rPr>
+          <w:b/>
+          <w:color w:val="444444"/>
+          <w:sz w:val="19"/>
+          <w:bdr w:val="single" w:sz="2" w:space="3" w:color="BBBBBB"/>
+        </w:rPr>
+        <w:t>Who:</w:t>
+      </w:r>
+      <w:r>
+        <w:rPr>
+          <w:sz w:val="19"/>
+          <w:bdr w:val="single" w:sz="2" w:space="3" w:color="BBBBBB"/>
+        </w:rPr>
+        <w:t xml:space="preserve"> LangChain, ElevenLabs, Airia, Maisa AI, DeepOpinion, Workfabric AI, Vida, Decagon, Cresta, Moveworks, Pactum, Pavus AI, Prosper AI, Crescendo</w:t>
+      </w:r>
+    </w:p>
+    <w:p>
+      <w:pPr>
+        <w:pStyle w:val="BodyText"/>
+        <w:bidi w:val="0"/>
+        <w:jc w:val="left"/>
+        <w:rPr/>
+      </w:pPr>
+      <w:r>
+        <w:rPr>
+          <w:rStyle w:val="Strong"/>
+        </w:rPr>
+        <w:t>What this means:</w:t>
+      </w:r>
+      <w:r>
+        <w:rPr/>
+        <w:t xml:space="preserve"> Series A and B are most of the universe; 14 have no stage on file.</w:t>
+      </w:r>
+    </w:p>
+    <w:p>
+      <w:pPr>
+        <w:pStyle w:val="Heading3"/>
+        <w:bidi w:val="0"/>
+        <w:jc w:val="left"/>
+        <w:rPr/>
+      </w:pPr>
+      <w:r>
+        <w:rPr/>
+        <w:t>8.6 Thesis position [inference]</w:t>
+      </w:r>
+    </w:p>
+    <w:p>
+      <w:pPr>
+        <w:pStyle w:val="BodyText"/>
+        <w:keepLines/>
+        <w:bidi w:val="0"/>
+        <w:spacing w:before="60" w:after="60"/>
+        <w:ind w:hanging="0" w:left="140" w:right="140"/>
+        <w:jc w:val="left"/>
+        <w:rPr>
+          <w:b/>
+          <w:bdr w:val="single" w:sz="2" w:space="3" w:color="BBBBBB"/>
+        </w:rPr>
+      </w:pPr>
+      <w:r>
+        <w:rPr>
+          <w:b/>
+          <w:bdr w:val="single" w:sz="2" w:space="3" w:color="BBBBBB"/>
+        </w:rPr>
+        <w:t>Fits: vertical app that owns a workflow</w:t>
+      </w:r>
+    </w:p>
+    <w:p>
+      <w:pPr>
+        <w:pStyle w:val="BodyText"/>
+        <w:keepLines/>
+        <w:bidi w:val="0"/>
+        <w:spacing w:before="20" w:after="20"/>
+        <w:ind w:hanging="0" w:left="160" w:right="160"/>
+        <w:jc w:val="left"/>
+        <w:rPr>
+          <w:sz w:val="19"/>
+          <w:bdr w:val="single" w:sz="2" w:space="3" w:color="BBBBBB"/>
+        </w:rPr>
+      </w:pPr>
+      <w:r>
+        <w:rPr>
+          <w:b/>
+          <w:color w:val="444444"/>
+          <w:sz w:val="19"/>
+          <w:bdr w:val="single" w:sz="2" w:space="3" w:color="BBBBBB"/>
+        </w:rPr>
+        <w:t>n:</w:t>
+      </w:r>
+      <w:r>
+        <w:rPr>
+          <w:sz w:val="19"/>
+          <w:bdr w:val="single" w:sz="2" w:space="3" w:color="BBBBBB"/>
+        </w:rPr>
+        <w:t xml:space="preserve"> 29</w:t>
+      </w:r>
+    </w:p>
+    <w:p>
+      <w:pPr>
+        <w:pStyle w:val="BodyText"/>
+        <w:keepLines/>
+        <w:bidi w:val="0"/>
+        <w:spacing w:before="20" w:after="20"/>
+        <w:ind w:hanging="0" w:left="160" w:right="160"/>
+        <w:jc w:val="left"/>
+        <w:rPr>
+          <w:sz w:val="19"/>
+          <w:bdr w:val="single" w:sz="2" w:space="3" w:color="BBBBBB"/>
+        </w:rPr>
+      </w:pPr>
+      <w:r>
+        <w:rPr>
+          <w:b/>
+          <w:color w:val="444444"/>
+          <w:sz w:val="19"/>
+          <w:bdr w:val="single" w:sz="2" w:space="3" w:color="BBBBBB"/>
+        </w:rPr>
+        <w:t>Who:</w:t>
+      </w:r>
+      <w:r>
+        <w:rPr>
+          <w:sz w:val="19"/>
+          <w:bdr w:val="single" w:sz="2" w:space="3" w:color="BBBBBB"/>
+        </w:rPr>
+        <w:t xml:space="preserve"> Actively AI, Attention, Vida, Sierra, Decagon, Omilia, respond.io, Cresta, Adaptive, Basis, Definite, Elimentary, Xelix, Zolvo, Zomma, Lio, Pactum, Pavus AI, Adonis, Amperos Health, Candid Health, ClearRisk AI, Notch, Ivo, Wordsmith, Orbio, Spott, Take2, NeuBird AI</w:t>
+      </w:r>
+    </w:p>
+    <w:p>
+      <w:pPr>
+        <w:pStyle w:val="BodyText"/>
+        <w:keepLines/>
+        <w:bidi w:val="0"/>
+        <w:spacing w:before="60" w:after="60"/>
+        <w:ind w:hanging="0" w:left="140" w:right="140"/>
+        <w:jc w:val="left"/>
+        <w:rPr>
+          <w:b/>
+          <w:bdr w:val="single" w:sz="2" w:space="3" w:color="BBBBBB"/>
+        </w:rPr>
+      </w:pPr>
+      <w:r>
+        <w:rPr>
+          <w:b/>
+          <w:bdr w:val="single" w:sz="2" w:space="3" w:color="BBBBBB"/>
+        </w:rPr>
+        <w:t>Fits: rides on the system of record</w:t>
+      </w:r>
+    </w:p>
+    <w:p>
+      <w:pPr>
+        <w:pStyle w:val="BodyText"/>
+        <w:keepLines/>
+        <w:bidi w:val="0"/>
+        <w:spacing w:before="20" w:after="20"/>
+        <w:ind w:hanging="0" w:left="160" w:right="160"/>
+        <w:jc w:val="left"/>
+        <w:rPr>
+          <w:sz w:val="19"/>
+          <w:bdr w:val="single" w:sz="2" w:space="3" w:color="BBBBBB"/>
+        </w:rPr>
+      </w:pPr>
+      <w:r>
+        <w:rPr>
+          <w:b/>
+          <w:color w:val="444444"/>
+          <w:sz w:val="19"/>
+          <w:bdr w:val="single" w:sz="2" w:space="3" w:color="BBBBBB"/>
+        </w:rPr>
+        <w:t>n:</w:t>
+      </w:r>
+      <w:r>
+        <w:rPr>
+          <w:sz w:val="19"/>
+          <w:bdr w:val="single" w:sz="2" w:space="3" w:color="BBBBBB"/>
+        </w:rPr>
+        <w:t xml:space="preserve"> 5</w:t>
+      </w:r>
+    </w:p>
+    <w:p>
+      <w:pPr>
+        <w:pStyle w:val="BodyText"/>
+        <w:keepLines/>
+        <w:bidi w:val="0"/>
+        <w:spacing w:before="20" w:after="20"/>
+        <w:ind w:hanging="0" w:left="160" w:right="160"/>
+        <w:jc w:val="left"/>
+        <w:rPr>
+          <w:sz w:val="19"/>
+          <w:bdr w:val="single" w:sz="2" w:space="3" w:color="BBBBBB"/>
+        </w:rPr>
+      </w:pPr>
+      <w:r>
+        <w:rPr>
+          <w:b/>
+          <w:color w:val="444444"/>
+          <w:sz w:val="19"/>
+          <w:bdr w:val="single" w:sz="2" w:space="3" w:color="BBBBBB"/>
+        </w:rPr>
+        <w:t>Who:</w:t>
+      </w:r>
+      <w:r>
+        <w:rPr>
+          <w:sz w:val="19"/>
+          <w:bdr w:val="single" w:sz="2" w:space="3" w:color="BBBBBB"/>
+        </w:rPr>
+        <w:t xml:space="preserve"> Moveworks, Didero, Magentic, Walter, GenHealth.ai</w:t>
+      </w:r>
+    </w:p>
+    <w:p>
+      <w:pPr>
+        <w:pStyle w:val="BodyText"/>
+        <w:keepLines/>
+        <w:bidi w:val="0"/>
+        <w:spacing w:before="60" w:after="60"/>
+        <w:ind w:hanging="0" w:left="140" w:right="140"/>
+        <w:jc w:val="left"/>
+        <w:rPr>
+          <w:b/>
+          <w:bdr w:val="single" w:sz="2" w:space="3" w:color="BBBBBB"/>
+        </w:rPr>
+      </w:pPr>
+      <w:r>
+        <w:rPr>
+          <w:b/>
+          <w:bdr w:val="single" w:sz="2" w:space="3" w:color="BBBBBB"/>
+        </w:rPr>
+        <w:t>Fits: sells the outcome as a service</w:t>
+      </w:r>
+    </w:p>
+    <w:p>
+      <w:pPr>
+        <w:pStyle w:val="BodyText"/>
+        <w:keepLines/>
+        <w:bidi w:val="0"/>
+        <w:spacing w:before="20" w:after="20"/>
+        <w:ind w:hanging="0" w:left="160" w:right="160"/>
+        <w:jc w:val="left"/>
+        <w:rPr>
+          <w:sz w:val="19"/>
+          <w:bdr w:val="single" w:sz="2" w:space="3" w:color="BBBBBB"/>
+        </w:rPr>
+      </w:pPr>
+      <w:r>
+        <w:rPr>
+          <w:b/>
+          <w:color w:val="444444"/>
+          <w:sz w:val="19"/>
+          <w:bdr w:val="single" w:sz="2" w:space="3" w:color="BBBBBB"/>
+        </w:rPr>
+        <w:t>n:</w:t>
+      </w:r>
+      <w:r>
+        <w:rPr>
+          <w:sz w:val="19"/>
+          <w:bdr w:val="single" w:sz="2" w:space="3" w:color="BBBBBB"/>
+        </w:rPr>
+        <w:t xml:space="preserve"> 5</w:t>
+      </w:r>
+    </w:p>
+    <w:p>
+      <w:pPr>
+        <w:pStyle w:val="BodyText"/>
+        <w:keepLines/>
+        <w:bidi w:val="0"/>
+        <w:spacing w:before="20" w:after="20"/>
+        <w:ind w:hanging="0" w:left="160" w:right="160"/>
+        <w:jc w:val="left"/>
+        <w:rPr>
+          <w:sz w:val="19"/>
+          <w:bdr w:val="single" w:sz="2" w:space="3" w:color="BBBBBB"/>
+        </w:rPr>
+      </w:pPr>
+      <w:r>
+        <w:rPr>
+          <w:b/>
+          <w:color w:val="444444"/>
+          <w:sz w:val="19"/>
+          <w:bdr w:val="single" w:sz="2" w:space="3" w:color="BBBBBB"/>
+        </w:rPr>
+        <w:t>Who:</w:t>
+      </w:r>
+      <w:r>
+        <w:rPr>
+          <w:sz w:val="19"/>
+          <w:bdr w:val="single" w:sz="2" w:space="3" w:color="BBBBBB"/>
+        </w:rPr>
+        <w:t xml:space="preserve"> Procode, Prosper AI, Pace, Crosby, Crescendo</w:t>
+      </w:r>
+    </w:p>
+    <w:p>
+      <w:pPr>
+        <w:pStyle w:val="BodyText"/>
+        <w:keepLines/>
+        <w:bidi w:val="0"/>
+        <w:spacing w:before="60" w:after="60"/>
+        <w:ind w:hanging="0" w:left="140" w:right="140"/>
+        <w:jc w:val="left"/>
+        <w:rPr>
+          <w:b/>
+          <w:bdr w:val="single" w:sz="2" w:space="3" w:color="BBBBBB"/>
+        </w:rPr>
+      </w:pPr>
+      <w:r>
+        <w:rPr>
+          <w:b/>
+          <w:bdr w:val="single" w:sz="2" w:space="3" w:color="BBBBBB"/>
+        </w:rPr>
+        <w:t>Channel: SI, BPO or managed service</w:t>
+      </w:r>
+    </w:p>
+    <w:p>
+      <w:pPr>
+        <w:pStyle w:val="BodyText"/>
+        <w:keepLines/>
+        <w:bidi w:val="0"/>
+        <w:spacing w:before="20" w:after="20"/>
+        <w:ind w:hanging="0" w:left="160" w:right="160"/>
+        <w:jc w:val="left"/>
+        <w:rPr>
+          <w:sz w:val="19"/>
+          <w:bdr w:val="single" w:sz="2" w:space="3" w:color="BBBBBB"/>
+        </w:rPr>
+      </w:pPr>
+      <w:r>
+        <w:rPr>
+          <w:b/>
+          <w:color w:val="444444"/>
+          <w:sz w:val="19"/>
+          <w:bdr w:val="single" w:sz="2" w:space="3" w:color="BBBBBB"/>
+        </w:rPr>
+        <w:t>n:</w:t>
+      </w:r>
+      <w:r>
+        <w:rPr>
+          <w:sz w:val="19"/>
+          <w:bdr w:val="single" w:sz="2" w:space="3" w:color="BBBBBB"/>
+        </w:rPr>
+        <w:t xml:space="preserve"> 4</w:t>
+      </w:r>
+    </w:p>
+    <w:p>
+      <w:pPr>
+        <w:pStyle w:val="BodyText"/>
+        <w:keepLines/>
+        <w:bidi w:val="0"/>
+        <w:spacing w:before="20" w:after="20"/>
+        <w:ind w:hanging="0" w:left="160" w:right="160"/>
+        <w:jc w:val="left"/>
+        <w:rPr>
+          <w:sz w:val="19"/>
+          <w:bdr w:val="single" w:sz="2" w:space="3" w:color="BBBBBB"/>
+        </w:rPr>
+      </w:pPr>
+      <w:r>
+        <w:rPr>
+          <w:b/>
+          <w:color w:val="444444"/>
+          <w:sz w:val="19"/>
+          <w:bdr w:val="single" w:sz="2" w:space="3" w:color="BBBBBB"/>
+        </w:rPr>
+        <w:t>Who:</w:t>
+      </w:r>
+      <w:r>
+        <w:rPr>
+          <w:sz w:val="19"/>
+          <w:bdr w:val="single" w:sz="2" w:space="3" w:color="BBBBBB"/>
+        </w:rPr>
+        <w:t xml:space="preserve"> DeepOpinion, Otera, RapidCanvas, AuxoAI</w:t>
+      </w:r>
+    </w:p>
+    <w:p>
+      <w:pPr>
+        <w:pStyle w:val="BodyText"/>
+        <w:keepLines/>
+        <w:bidi w:val="0"/>
+        <w:spacing w:before="60" w:after="60"/>
+        <w:ind w:hanging="0" w:left="140" w:right="140"/>
+        <w:jc w:val="left"/>
+        <w:rPr>
+          <w:b/>
+          <w:bdr w:val="single" w:sz="2" w:space="3" w:color="BBBBBB"/>
+        </w:rPr>
+      </w:pPr>
+      <w:r>
+        <w:rPr>
+          <w:b/>
+          <w:bdr w:val="single" w:sz="2" w:space="3" w:color="BBBBBB"/>
+        </w:rPr>
+        <w:t>Exposed: horizontal orchestration or context</w:t>
+      </w:r>
+    </w:p>
+    <w:p>
+      <w:pPr>
+        <w:pStyle w:val="BodyText"/>
+        <w:keepLines/>
+        <w:bidi w:val="0"/>
+        <w:spacing w:before="20" w:after="20"/>
+        <w:ind w:hanging="0" w:left="160" w:right="160"/>
+        <w:jc w:val="left"/>
+        <w:rPr>
+          <w:sz w:val="19"/>
+          <w:bdr w:val="single" w:sz="2" w:space="3" w:color="BBBBBB"/>
+        </w:rPr>
+      </w:pPr>
+      <w:r>
+        <w:rPr>
+          <w:b/>
+          <w:color w:val="444444"/>
+          <w:sz w:val="19"/>
+          <w:bdr w:val="single" w:sz="2" w:space="3" w:color="BBBBBB"/>
+        </w:rPr>
+        <w:t>n:</w:t>
+      </w:r>
+      <w:r>
+        <w:rPr>
+          <w:sz w:val="19"/>
+          <w:bdr w:val="single" w:sz="2" w:space="3" w:color="BBBBBB"/>
+        </w:rPr>
+        <w:t xml:space="preserve"> 9</w:t>
+      </w:r>
+    </w:p>
+    <w:p>
+      <w:pPr>
+        <w:pStyle w:val="BodyText"/>
+        <w:keepLines/>
+        <w:bidi w:val="0"/>
+        <w:spacing w:before="20" w:after="20"/>
+        <w:ind w:hanging="0" w:left="160" w:right="160"/>
+        <w:jc w:val="left"/>
+        <w:rPr>
+          <w:sz w:val="19"/>
+          <w:bdr w:val="single" w:sz="2" w:space="3" w:color="BBBBBB"/>
+        </w:rPr>
+      </w:pPr>
+      <w:r>
+        <w:rPr>
+          <w:b/>
+          <w:color w:val="444444"/>
+          <w:sz w:val="19"/>
+          <w:bdr w:val="single" w:sz="2" w:space="3" w:color="BBBBBB"/>
+        </w:rPr>
+        <w:t>Who:</w:t>
+      </w:r>
+      <w:r>
+        <w:rPr>
+          <w:sz w:val="19"/>
+          <w:bdr w:val="single" w:sz="2" w:space="3" w:color="BBBBBB"/>
+        </w:rPr>
+        <w:t xml:space="preserve"> Ema, Kestra, Duvo, Sycamore, Airia, Maisa AI, Mimica, Skan AI, Workfabric AI</w:t>
+      </w:r>
+    </w:p>
+    <w:p>
+      <w:pPr>
+        <w:pStyle w:val="BodyText"/>
+        <w:keepLines/>
+        <w:bidi w:val="0"/>
+        <w:spacing w:before="60" w:after="60"/>
+        <w:ind w:hanging="0" w:left="140" w:right="140"/>
+        <w:jc w:val="left"/>
+        <w:rPr>
+          <w:b/>
+          <w:bdr w:val="single" w:sz="2" w:space="3" w:color="BBBBBB"/>
+        </w:rPr>
+      </w:pPr>
+      <w:r>
+        <w:rPr>
+          <w:b/>
+          <w:bdr w:val="single" w:sz="2" w:space="3" w:color="BBBBBB"/>
+        </w:rPr>
+        <w:t>Neutral: picks and shovels (infra, evals, security)</w:t>
+      </w:r>
+    </w:p>
+    <w:p>
+      <w:pPr>
+        <w:pStyle w:val="BodyText"/>
+        <w:keepLines/>
+        <w:bidi w:val="0"/>
+        <w:spacing w:before="20" w:after="20"/>
+        <w:ind w:hanging="0" w:left="160" w:right="160"/>
+        <w:jc w:val="left"/>
+        <w:rPr>
+          <w:sz w:val="19"/>
+          <w:bdr w:val="single" w:sz="2" w:space="3" w:color="BBBBBB"/>
+        </w:rPr>
+      </w:pPr>
+      <w:r>
+        <w:rPr>
+          <w:b/>
+          <w:color w:val="444444"/>
+          <w:sz w:val="19"/>
+          <w:bdr w:val="single" w:sz="2" w:space="3" w:color="BBBBBB"/>
+        </w:rPr>
+        <w:t>n:</w:t>
+      </w:r>
+      <w:r>
+        <w:rPr>
+          <w:sz w:val="19"/>
+          <w:bdr w:val="single" w:sz="2" w:space="3" w:color="BBBBBB"/>
+        </w:rPr>
+        <w:t xml:space="preserve"> 13</w:t>
+      </w:r>
+    </w:p>
+    <w:p>
+      <w:pPr>
+        <w:pStyle w:val="BodyText"/>
+        <w:keepLines/>
+        <w:bidi w:val="0"/>
+        <w:spacing w:before="20" w:after="20"/>
+        <w:ind w:hanging="0" w:left="160" w:right="160"/>
+        <w:jc w:val="left"/>
+        <w:rPr>
+          <w:sz w:val="19"/>
+          <w:bdr w:val="single" w:sz="2" w:space="3" w:color="BBBBBB"/>
+        </w:rPr>
+      </w:pPr>
+      <w:r>
+        <w:rPr>
+          <w:b/>
+          <w:color w:val="444444"/>
+          <w:sz w:val="19"/>
+          <w:bdr w:val="single" w:sz="2" w:space="3" w:color="BBBBBB"/>
+        </w:rPr>
+        <w:t>Who:</w:t>
+      </w:r>
+      <w:r>
+        <w:rPr>
+          <w:sz w:val="19"/>
+          <w:bdr w:val="single" w:sz="2" w:space="3" w:color="BBBBBB"/>
+        </w:rPr>
+        <w:t xml:space="preserve"> CopilotKit, Coval, Dash0, Daytona, Flexprice, InsightFinder, Natural, Raindrop, Rein, Runlayer, Tsuga, LangChain, ElevenLabs</w:t>
+      </w:r>
+    </w:p>
+    <w:p>
+      <w:pPr>
+        <w:pStyle w:val="BodyText"/>
+        <w:bidi w:val="0"/>
+        <w:jc w:val="left"/>
+        <w:rPr/>
+      </w:pPr>
+      <w:r>
+        <w:rPr>
+          <w:rStyle w:val="Strong"/>
+        </w:rPr>
+        <w:t>What this means:</w:t>
+      </w:r>
+      <w:r>
+        <w:rPr/>
+        <w:t xml:space="preserve"> six in ten fit the thesis; the horizontal group carries the most absorption risk from labs and systems of record.</w:t>
       </w:r>
     </w:p>
     <w:p>

</xml_diff>

<commit_message>
grokbot oba: 41 sources (more vertical and horizontal players)
</commit_message>
<xml_diff>
--- a/themes/outcome-based-agents/insights/primer.docx
+++ b/themes/outcome-based-agents/insights/primer.docx
@@ -16787,7 +16787,7 @@
       </w:pPr>
       <w:r>
         <w:rPr/>
-        <w:t>65 startups, cut six ways. Each sits in exactly one group per cut. Full table with a source id on every row: insights/landscape-cuts.md. Pricing and stage come only from filed sources; thesis position is [inference].</w:t>
+        <w:t>101 startups, cut six ways: the first 65 plus 36 vertical and horizontal players added 2026-10-28 from 2025 to 2026 funding reports and six VC primers (Foundation Capital, a16z twice, Bessemer three times; see insights/landscape-cuts.md for source ids). Late private names (Series D and later: Parloa, EvenUp, EliseAI, Federato, Glean, Sierra, Candid Health) are comps, outside the Seed to Series C check band. Each sits in exactly one group per cut. Full table with a source id on every row: insights/landscape-cuts.md. Pricing and stage come only from filed sources; thesis position is [inference].</w:t>
       </w:r>
     </w:p>
     <w:p>
@@ -16862,7 +16862,7 @@
           <w:sz w:val="19"/>
           <w:bdr w:val="single" w:sz="2" w:space="3" w:color="BBBBBB"/>
         </w:rPr>
-        <w:t xml:space="preserve"> 39</w:t>
+        <w:t xml:space="preserve"> 70</w:t>
       </w:r>
     </w:p>
     <w:p>
@@ -16892,7 +16892,7 @@
           <w:sz w:val="19"/>
           <w:bdr w:val="single" w:sz="2" w:space="3" w:color="BBBBBB"/>
         </w:rPr>
-        <w:t xml:space="preserve"> Actively AI, Attention, Vida, Sierra, Decagon, Omilia, respond.io, Cresta, Moveworks, Adaptive, Basis, Definite, Elimentary, Xelix, Zolvo, Zomma, Didero, Lio, Magentic, Walter, Pactum, Pavus AI, Adonis, Amperos Health, Candid Health, GenHealth.ai, Procode, Prosper AI, ClearRisk AI, Notch, Pace, Crosby, Ivo, Wordsmith, Orbio, Spott, Take2, NeuBird AI, Crescendo</w:t>
+        <w:t xml:space="preserve"> Actively AI, Attention, Vida, Sierra, Decagon, Omilia, respond.io, Cresta, Moveworks, Adaptive, Basis, Definite, Elimentary, Xelix, Zolvo, Zomma, Didero, Lio, Magentic, Walter, Pactum, Pavus AI, Adonis, Amperos Health, Candid Health, GenHealth.ai, Procode, Prosper AI, ClearRisk AI, Notch, Pace, Crosby, Ivo, Wordsmith, Orbio, Spott, Take2, NeuBird AI, Crescendo, Rillet, Campfire, Tabs, Stuut, Tennr, Assort Health, Sixfold, Reserv, Harper, Federato, Eudia, Supio, EvenUp, ConverzAI, Juicebox, Rox, Unify, Parloa, Lorikeet, Gradient Labs, Resolve AI, Traversal, Serval, EliseAI, HappyRobot, Augment, GovDash, Polimorphic, Levelpath, Omnea, PolyAI</w:t>
       </w:r>
     </w:p>
     <w:p>
@@ -16943,7 +16943,7 @@
           <w:sz w:val="19"/>
           <w:bdr w:val="single" w:sz="2" w:space="3" w:color="BBBBBB"/>
         </w:rPr>
-        <w:t xml:space="preserve"> 9</w:t>
+        <w:t xml:space="preserve"> 13</w:t>
       </w:r>
     </w:p>
     <w:p>
@@ -16973,7 +16973,7 @@
           <w:sz w:val="19"/>
           <w:bdr w:val="single" w:sz="2" w:space="3" w:color="BBBBBB"/>
         </w:rPr>
-        <w:t xml:space="preserve"> Ema, Kestra, Duvo, Sycamore, Airia, Maisa AI, Mimica, Skan AI, Workfabric AI</w:t>
+        <w:t xml:space="preserve"> Ema, Kestra, Duvo, Sycamore, Airia, Maisa AI, Mimica, Skan AI, Workfabric AI, Relevance AI, n8n, Unframe, Glean</w:t>
       </w:r>
     </w:p>
     <w:p>
@@ -17024,7 +17024,7 @@
           <w:sz w:val="19"/>
           <w:bdr w:val="single" w:sz="2" w:space="3" w:color="BBBBBB"/>
         </w:rPr>
-        <w:t xml:space="preserve"> 4</w:t>
+        <w:t xml:space="preserve"> 5</w:t>
       </w:r>
     </w:p>
     <w:p>
@@ -17054,7 +17054,7 @@
           <w:sz w:val="19"/>
           <w:bdr w:val="single" w:sz="2" w:space="3" w:color="BBBBBB"/>
         </w:rPr>
-        <w:t xml:space="preserve"> DeepOpinion, Otera, RapidCanvas, AuxoAI</w:t>
+        <w:t xml:space="preserve"> DeepOpinion, Otera, RapidCanvas, AuxoAI, Distyl AI</w:t>
       </w:r>
     </w:p>
     <w:p>
@@ -17153,7 +17153,7 @@
       </w:r>
       <w:r>
         <w:rPr/>
-        <w:t xml:space="preserve"> venture money is in vertical apps; the other worlds belong to incumbents.</w:t>
+        <w:t xml:space="preserve"> venture money is in vertical apps (70 of 101); the other worlds belong to incumbents. The four added horizontal names (Relevance AI, n8n, Unframe, Glean) raised bigger rounds than the first nine but sit where labs and systems of record are moving. Distyl AI is placed with AI services [inference].</w:t>
       </w:r>
     </w:p>
     <w:p>
@@ -17216,7 +17216,7 @@
           <w:sz w:val="19"/>
           <w:bdr w:val="single" w:sz="2" w:space="3" w:color="BBBBBB"/>
         </w:rPr>
-        <w:t xml:space="preserve"> 7</w:t>
+        <w:t xml:space="preserve"> 11</w:t>
       </w:r>
     </w:p>
     <w:p>
@@ -17246,7 +17246,7 @@
           <w:sz w:val="19"/>
           <w:bdr w:val="single" w:sz="2" w:space="3" w:color="BBBBBB"/>
         </w:rPr>
-        <w:t xml:space="preserve"> ElevenLabs, Sierra, Decagon, Omilia, respond.io, Cresta, Crescendo</w:t>
+        <w:t xml:space="preserve"> ElevenLabs, Sierra, Decagon, Omilia, respond.io, Cresta, Crescendo, Parloa, Lorikeet, Gradient Labs, PolyAI</w:t>
       </w:r>
     </w:p>
     <w:p>
@@ -17297,7 +17297,7 @@
           <w:sz w:val="19"/>
           <w:bdr w:val="single" w:sz="2" w:space="3" w:color="BBBBBB"/>
         </w:rPr>
-        <w:t xml:space="preserve"> 3</w:t>
+        <w:t xml:space="preserve"> 5</w:t>
       </w:r>
     </w:p>
     <w:p>
@@ -17327,7 +17327,7 @@
           <w:sz w:val="19"/>
           <w:bdr w:val="single" w:sz="2" w:space="3" w:color="BBBBBB"/>
         </w:rPr>
-        <w:t xml:space="preserve"> Actively AI, Attention, Vida</w:t>
+        <w:t xml:space="preserve"> Actively AI, Attention, Vida, Rox, Unify</w:t>
       </w:r>
     </w:p>
     <w:p>
@@ -17378,7 +17378,7 @@
           <w:sz w:val="19"/>
           <w:bdr w:val="single" w:sz="2" w:space="3" w:color="BBBBBB"/>
         </w:rPr>
-        <w:t xml:space="preserve"> 7</w:t>
+        <w:t xml:space="preserve"> 11</w:t>
       </w:r>
     </w:p>
     <w:p>
@@ -17408,7 +17408,7 @@
           <w:sz w:val="19"/>
           <w:bdr w:val="single" w:sz="2" w:space="3" w:color="BBBBBB"/>
         </w:rPr>
-        <w:t xml:space="preserve"> Adaptive, Basis, Definite, Elimentary, Xelix, Zolvo, Zomma</w:t>
+        <w:t xml:space="preserve"> Adaptive, Basis, Definite, Elimentary, Xelix, Zolvo, Zomma, Rillet, Campfire, Tabs, Stuut</w:t>
       </w:r>
     </w:p>
     <w:p>
@@ -17429,7 +17429,7 @@
           <w:b/>
           <w:bdr w:val="single" w:sz="2" w:space="3" w:color="BBBBBB"/>
         </w:rPr>
-        <w:t>Procurement and supply chain</w:t>
+        <w:t>Procurement, supply chain and logistics</w:t>
       </w:r>
     </w:p>
     <w:p>
@@ -17459,7 +17459,7 @@
           <w:sz w:val="19"/>
           <w:bdr w:val="single" w:sz="2" w:space="3" w:color="BBBBBB"/>
         </w:rPr>
-        <w:t xml:space="preserve"> 6</w:t>
+        <w:t xml:space="preserve"> 10</w:t>
       </w:r>
     </w:p>
     <w:p>
@@ -17489,7 +17489,7 @@
           <w:sz w:val="19"/>
           <w:bdr w:val="single" w:sz="2" w:space="3" w:color="BBBBBB"/>
         </w:rPr>
-        <w:t xml:space="preserve"> Didero, Lio, Magentic, Walter, Pactum, Pavus AI</w:t>
+        <w:t xml:space="preserve"> Didero, Lio, Magentic, Walter, Pactum, Pavus AI, HappyRobot, Augment, Levelpath, Omnea</w:t>
       </w:r>
     </w:p>
     <w:p>
@@ -17540,7 +17540,7 @@
           <w:sz w:val="19"/>
           <w:bdr w:val="single" w:sz="2" w:space="3" w:color="BBBBBB"/>
         </w:rPr>
-        <w:t xml:space="preserve"> 6</w:t>
+        <w:t xml:space="preserve"> 8</w:t>
       </w:r>
     </w:p>
     <w:p>
@@ -17570,7 +17570,7 @@
           <w:sz w:val="19"/>
           <w:bdr w:val="single" w:sz="2" w:space="3" w:color="BBBBBB"/>
         </w:rPr>
-        <w:t xml:space="preserve"> Adonis, Amperos Health, Candid Health, GenHealth.ai, Procode, Prosper AI</w:t>
+        <w:t xml:space="preserve"> Adonis, Amperos Health, Candid Health, GenHealth.ai, Procode, Prosper AI, Tennr, Assort Health</w:t>
       </w:r>
     </w:p>
     <w:p>
@@ -17621,7 +17621,7 @@
           <w:sz w:val="19"/>
           <w:bdr w:val="single" w:sz="2" w:space="3" w:color="BBBBBB"/>
         </w:rPr>
-        <w:t xml:space="preserve"> 5</w:t>
+        <w:t xml:space="preserve"> 9</w:t>
       </w:r>
     </w:p>
     <w:p>
@@ -17651,7 +17651,7 @@
           <w:sz w:val="19"/>
           <w:bdr w:val="single" w:sz="2" w:space="3" w:color="BBBBBB"/>
         </w:rPr>
-        <w:t xml:space="preserve"> DeepOpinion, ClearRisk AI, Notch, Pace, Otera</w:t>
+        <w:t xml:space="preserve"> DeepOpinion, ClearRisk AI, Notch, Pace, Otera, Sixfold, Reserv, Harper, Federato</w:t>
       </w:r>
     </w:p>
     <w:p>
@@ -17702,7 +17702,7 @@
           <w:sz w:val="19"/>
           <w:bdr w:val="single" w:sz="2" w:space="3" w:color="BBBBBB"/>
         </w:rPr>
-        <w:t xml:space="preserve"> 3</w:t>
+        <w:t xml:space="preserve"> 6</w:t>
       </w:r>
     </w:p>
     <w:p>
@@ -17732,7 +17732,7 @@
           <w:sz w:val="19"/>
           <w:bdr w:val="single" w:sz="2" w:space="3" w:color="BBBBBB"/>
         </w:rPr>
-        <w:t xml:space="preserve"> Crosby, Ivo, Wordsmith</w:t>
+        <w:t xml:space="preserve"> Crosby, Ivo, Wordsmith, Eudia, Supio, EvenUp</w:t>
       </w:r>
     </w:p>
     <w:p>
@@ -17783,7 +17783,7 @@
           <w:sz w:val="19"/>
           <w:bdr w:val="single" w:sz="2" w:space="3" w:color="BBBBBB"/>
         </w:rPr>
-        <w:t xml:space="preserve"> 3</w:t>
+        <w:t xml:space="preserve"> 5</w:t>
       </w:r>
     </w:p>
     <w:p>
@@ -17813,7 +17813,7 @@
           <w:sz w:val="19"/>
           <w:bdr w:val="single" w:sz="2" w:space="3" w:color="BBBBBB"/>
         </w:rPr>
-        <w:t xml:space="preserve"> Orbio, Spott, Take2</w:t>
+        <w:t xml:space="preserve"> Orbio, Spott, Take2, ConverzAI, Juicebox</w:t>
       </w:r>
     </w:p>
     <w:p>
@@ -17864,7 +17864,7 @@
           <w:sz w:val="19"/>
           <w:bdr w:val="single" w:sz="2" w:space="3" w:color="BBBBBB"/>
         </w:rPr>
-        <w:t xml:space="preserve"> 14</w:t>
+        <w:t xml:space="preserve"> 17</w:t>
       </w:r>
     </w:p>
     <w:p>
@@ -17894,7 +17894,7 @@
           <w:sz w:val="19"/>
           <w:bdr w:val="single" w:sz="2" w:space="3" w:color="BBBBBB"/>
         </w:rPr>
-        <w:t xml:space="preserve"> CopilotKit, Coval, Dash0, Daytona, Flexprice, InsightFinder, Natural, Raindrop, Rein, Runlayer, Tsuga, LangChain, Moveworks, NeuBird AI</w:t>
+        <w:t xml:space="preserve"> CopilotKit, Coval, Dash0, Daytona, Flexprice, InsightFinder, Natural, Raindrop, Rein, Runlayer, Tsuga, LangChain, Moveworks, NeuBird AI, Resolve AI, Traversal, Serval</w:t>
       </w:r>
     </w:p>
     <w:p>
@@ -17915,7 +17915,7 @@
           <w:b/>
           <w:bdr w:val="single" w:sz="2" w:space="3" w:color="BBBBBB"/>
         </w:rPr>
-        <w:t>Cross-function (no single buyer)</w:t>
+        <w:t>Real estate and property ops</w:t>
       </w:r>
     </w:p>
     <w:p>
@@ -17945,7 +17945,7 @@
           <w:sz w:val="19"/>
           <w:bdr w:val="single" w:sz="2" w:space="3" w:color="BBBBBB"/>
         </w:rPr>
-        <w:t xml:space="preserve"> 11</w:t>
+        <w:t xml:space="preserve"> 1</w:t>
       </w:r>
     </w:p>
     <w:p>
@@ -17975,49 +17975,7 @@
           <w:sz w:val="19"/>
           <w:bdr w:val="single" w:sz="2" w:space="3" w:color="BBBBBB"/>
         </w:rPr>
-        <w:t xml:space="preserve"> Ema, Kestra, Duvo, Sycamore, Airia, Maisa AI, Mimica, Skan AI, Workfabric AI, RapidCanvas, AuxoAI</w:t>
-      </w:r>
-    </w:p>
-    <w:p>
-      <w:pPr>
-        <w:pStyle w:val="BodyText"/>
-        <w:bidi w:val="0"/>
-        <w:jc w:val="left"/>
-        <w:rPr/>
-      </w:pPr>
-      <w:r>
-        <w:rPr>
-          <w:rStyle w:val="Strong"/>
-        </w:rPr>
-        <w:t>What this means:</w:t>
-      </w:r>
-      <w:r>
-        <w:rPr/>
-        <w:t xml:space="preserve"> CX is crowded and late stage; finance, procurement, healthcare billing and insurance hold most early picks.</w:t>
-      </w:r>
-    </w:p>
-    <w:p>
-      <w:pPr>
-        <w:pStyle w:val="Heading3"/>
-        <w:bidi w:val="0"/>
-        <w:jc w:val="left"/>
-        <w:rPr/>
-      </w:pPr>
-      <w:r>
-        <w:rPr/>
-        <w:t>8.3 Pricing model</w:t>
-      </w:r>
-    </w:p>
-    <w:p>
-      <w:pPr>
-        <w:pStyle w:val="BodyText"/>
-        <w:bidi w:val="0"/>
-        <w:jc w:val="left"/>
-        <w:rPr/>
-      </w:pPr>
-      <w:r>
-        <w:rPr/>
-        <w:t>Sierra: under $2 per transaction plus about 10% of savings [src-20260710-37d40b]. Decagon: per meaningful conversation [src-20260515-de88a1]. Crescendo: per contact [src-20260724-865e53]. Outcome rows are company claims from their own releases.</w:t>
+        <w:t xml:space="preserve"> EliseAI</w:t>
       </w:r>
     </w:p>
     <w:p>
@@ -18038,7 +17996,7 @@
           <w:b/>
           <w:bdr w:val="single" w:sz="2" w:space="3" w:color="BBBBBB"/>
         </w:rPr>
-        <w:t>Per outcome or savings share</w:t>
+        <w:t>Government and public sector</w:t>
       </w:r>
     </w:p>
     <w:p>
@@ -18068,7 +18026,7 @@
           <w:sz w:val="19"/>
           <w:bdr w:val="single" w:sz="2" w:space="3" w:color="BBBBBB"/>
         </w:rPr>
-        <w:t xml:space="preserve"> 4</w:t>
+        <w:t xml:space="preserve"> 2</w:t>
       </w:r>
     </w:p>
     <w:p>
@@ -18098,7 +18056,7 @@
           <w:sz w:val="19"/>
           <w:bdr w:val="single" w:sz="2" w:space="3" w:color="BBBBBB"/>
         </w:rPr>
-        <w:t xml:space="preserve"> Ema, Vida, Procode, Crosby</w:t>
+        <w:t xml:space="preserve"> GovDash, Polimorphic</w:t>
       </w:r>
     </w:p>
     <w:p>
@@ -18119,7 +18077,7 @@
           <w:b/>
           <w:bdr w:val="single" w:sz="2" w:space="3" w:color="BBBBBB"/>
         </w:rPr>
-        <w:t>Per transaction, task, conversation or run</w:t>
+        <w:t>Cross-function (no single buyer)</w:t>
       </w:r>
     </w:p>
     <w:p>
@@ -18149,7 +18107,7 @@
           <w:sz w:val="19"/>
           <w:bdr w:val="single" w:sz="2" w:space="3" w:color="BBBBBB"/>
         </w:rPr>
-        <w:t xml:space="preserve"> 5</w:t>
+        <w:t xml:space="preserve"> 16</w:t>
       </w:r>
     </w:p>
     <w:p>
@@ -18179,7 +18137,49 @@
           <w:sz w:val="19"/>
           <w:bdr w:val="single" w:sz="2" w:space="3" w:color="BBBBBB"/>
         </w:rPr>
-        <w:t xml:space="preserve"> Duvo, DeepOpinion, Sierra, Decagon, Crescendo</w:t>
+        <w:t xml:space="preserve"> Ema, Kestra, Duvo, Sycamore, Airia, Maisa AI, Mimica, Skan AI, Workfabric AI, RapidCanvas, AuxoAI, Distyl AI, Relevance AI, n8n, Unframe, Glean</w:t>
+      </w:r>
+    </w:p>
+    <w:p>
+      <w:pPr>
+        <w:pStyle w:val="BodyText"/>
+        <w:bidi w:val="0"/>
+        <w:jc w:val="left"/>
+        <w:rPr/>
+      </w:pPr>
+      <w:r>
+        <w:rPr>
+          <w:rStyle w:val="Strong"/>
+        </w:rPr>
+        <w:t>What this means:</w:t>
+      </w:r>
+      <w:r>
+        <w:rPr/>
+        <w:t xml:space="preserve"> CX is crowded and late stage (Parloa at $3B, PolyAI at $750M added as comps [src-20260115-f3635c]); finance (11), procurement and logistics (10) and insurance (9) hold most early picks. Real estate (EliseAI) and government (GovDash, Polimorphic) are new groups.</w:t>
+      </w:r>
+    </w:p>
+    <w:p>
+      <w:pPr>
+        <w:pStyle w:val="Heading3"/>
+        <w:bidi w:val="0"/>
+        <w:jc w:val="left"/>
+        <w:rPr/>
+      </w:pPr>
+      <w:r>
+        <w:rPr/>
+        <w:t>8.3 Pricing model</w:t>
+      </w:r>
+    </w:p>
+    <w:p>
+      <w:pPr>
+        <w:pStyle w:val="BodyText"/>
+        <w:bidi w:val="0"/>
+        <w:jc w:val="left"/>
+        <w:rPr/>
+      </w:pPr>
+      <w:r>
+        <w:rPr/>
+        <w:t>Sierra: under $2 per transaction plus about 10% of savings [src-20260710-37d40b]. Decagon: per meaningful conversation [src-20260515-de88a1]. Crescendo: per contact [src-20260724-865e53]. Outcome rows are company claims from their own releases. Added: EvenUp per demand package [src-20241205-4ac3cf]; Unframe says customers do not pay until they see impact (company claim) [src-20250403-82b140]. None of the 36 added names disclosed a price in its funding announcement.</w:t>
       </w:r>
     </w:p>
     <w:p>
@@ -18200,7 +18200,7 @@
           <w:b/>
           <w:bdr w:val="single" w:sz="2" w:space="3" w:color="BBBBBB"/>
         </w:rPr>
-        <w:t>Hybrid (part outcome, part usage)</w:t>
+        <w:t>Per outcome or savings share</w:t>
       </w:r>
     </w:p>
     <w:p>
@@ -18230,7 +18230,7 @@
           <w:sz w:val="19"/>
           <w:bdr w:val="single" w:sz="2" w:space="3" w:color="BBBBBB"/>
         </w:rPr>
-        <w:t xml:space="preserve"> 1</w:t>
+        <w:t xml:space="preserve"> 5</w:t>
       </w:r>
     </w:p>
     <w:p>
@@ -18260,7 +18260,7 @@
           <w:sz w:val="19"/>
           <w:bdr w:val="single" w:sz="2" w:space="3" w:color="BBBBBB"/>
         </w:rPr>
-        <w:t xml:space="preserve"> Prosper AI</w:t>
+        <w:t xml:space="preserve"> Ema, Vida, Procode, Crosby, Unframe</w:t>
       </w:r>
     </w:p>
     <w:p>
@@ -18281,7 +18281,7 @@
           <w:b/>
           <w:bdr w:val="single" w:sz="2" w:space="3" w:color="BBBBBB"/>
         </w:rPr>
-        <w:t>Usage (minutes, GB, cloud consumption)</w:t>
+        <w:t>Per transaction, task, conversation or run</w:t>
       </w:r>
     </w:p>
     <w:p>
@@ -18311,7 +18311,7 @@
           <w:sz w:val="19"/>
           <w:bdr w:val="single" w:sz="2" w:space="3" w:color="BBBBBB"/>
         </w:rPr>
-        <w:t xml:space="preserve"> 3</w:t>
+        <w:t xml:space="preserve"> 6</w:t>
       </w:r>
     </w:p>
     <w:p>
@@ -18341,7 +18341,7 @@
           <w:sz w:val="19"/>
           <w:bdr w:val="single" w:sz="2" w:space="3" w:color="BBBBBB"/>
         </w:rPr>
-        <w:t xml:space="preserve"> Tsuga, Kestra, Cresta</w:t>
+        <w:t xml:space="preserve"> Duvo, DeepOpinion, Sierra, Decagon, Crescendo, EvenUp</w:t>
       </w:r>
     </w:p>
     <w:p>
@@ -18362,7 +18362,7 @@
           <w:b/>
           <w:bdr w:val="single" w:sz="2" w:space="3" w:color="BBBBBB"/>
         </w:rPr>
-        <w:t>Subscription or seat</w:t>
+        <w:t>Hybrid (part outcome, part usage)</w:t>
       </w:r>
     </w:p>
     <w:p>
@@ -18422,7 +18422,7 @@
           <w:sz w:val="19"/>
           <w:bdr w:val="single" w:sz="2" w:space="3" w:color="BBBBBB"/>
         </w:rPr>
-        <w:t xml:space="preserve"> RapidCanvas</w:t>
+        <w:t xml:space="preserve"> Prosper AI</w:t>
       </w:r>
     </w:p>
     <w:p>
@@ -18443,7 +18443,7 @@
           <w:b/>
           <w:bdr w:val="single" w:sz="2" w:space="3" w:color="BBBBBB"/>
         </w:rPr>
-        <w:t>Not disclosed in any filed source</w:t>
+        <w:t>Usage (minutes, GB, cloud consumption)</w:t>
       </w:r>
     </w:p>
     <w:p>
@@ -18473,7 +18473,7 @@
           <w:sz w:val="19"/>
           <w:bdr w:val="single" w:sz="2" w:space="3" w:color="BBBBBB"/>
         </w:rPr>
-        <w:t xml:space="preserve"> 51</w:t>
+        <w:t xml:space="preserve"> 3</w:t>
       </w:r>
     </w:p>
     <w:p>
@@ -18503,37 +18503,7 @@
           <w:sz w:val="19"/>
           <w:bdr w:val="single" w:sz="2" w:space="3" w:color="BBBBBB"/>
         </w:rPr>
-        <w:t xml:space="preserve"> CopilotKit, Coval, Dash0, Daytona, Flexprice, InsightFinder, Natural, Raindrop, Rein, Runlayer, LangChain, ElevenLabs, Sycamore, Airia, Maisa AI, Mimica, Skan AI, Workfabric AI, Actively AI, Attention, Omilia, respond.io, Moveworks, Adaptive, Basis, Definite, Elimentary, Xelix, Zolvo, Zomma, Didero, Lio, Magentic, Walter, Pactum, Pavus AI, Adonis, Amperos Health, Candid Health, GenHealth.ai, ClearRisk AI, Notch, Pace, Otera, Ivo, Wordsmith, Orbio, Spott, Take2, NeuBird AI, AuxoAI</w:t>
-      </w:r>
-    </w:p>
-    <w:p>
-      <w:pPr>
-        <w:pStyle w:val="BodyText"/>
-        <w:bidi w:val="0"/>
-        <w:jc w:val="left"/>
-        <w:rPr/>
-      </w:pPr>
-      <w:r>
-        <w:rPr>
-          <w:rStyle w:val="Strong"/>
-        </w:rPr>
-        <w:t>What this means:</w:t>
-      </w:r>
-      <w:r>
-        <w:rPr/>
-        <w:t xml:space="preserve"> buyer-verified prices are per transaction; true outcome pricing is only claimed, by four startups.</w:t>
-      </w:r>
-    </w:p>
-    <w:p>
-      <w:pPr>
-        <w:pStyle w:val="Heading3"/>
-        <w:bidi w:val="0"/>
-        <w:jc w:val="left"/>
-        <w:rPr/>
-      </w:pPr>
-      <w:r>
-        <w:rPr/>
-        <w:t>8.4 Go-to-market channel</w:t>
+        <w:t xml:space="preserve"> Tsuga, Kestra, Cresta</w:t>
       </w:r>
     </w:p>
     <w:p>
@@ -18554,7 +18524,7 @@
           <w:b/>
           <w:bdr w:val="single" w:sz="2" w:space="3" w:color="BBBBBB"/>
         </w:rPr>
-        <w:t>Direct to the enterprise (no partner named in sources)</w:t>
+        <w:t>Subscription or seat</w:t>
       </w:r>
     </w:p>
     <w:p>
@@ -18584,7 +18554,7 @@
           <w:sz w:val="19"/>
           <w:bdr w:val="single" w:sz="2" w:space="3" w:color="BBBBBB"/>
         </w:rPr>
-        <w:t xml:space="preserve"> 45</w:t>
+        <w:t xml:space="preserve"> 1</w:t>
       </w:r>
     </w:p>
     <w:p>
@@ -18614,7 +18584,7 @@
           <w:sz w:val="19"/>
           <w:bdr w:val="single" w:sz="2" w:space="3" w:color="BBBBBB"/>
         </w:rPr>
-        <w:t xml:space="preserve"> Coval, Dash0, Daytona, InsightFinder, Natural, Raindrop, Rein, Runlayer, Tsuga, ElevenLabs, Ema, Duvo, Sycamore, Airia, Maisa AI, Mimica, Skan AI, Actively AI, Attention, Sierra, Decagon, Omilia, respond.io, Cresta, Adaptive, Basis, Definite, Elimentary, Xelix, Zolvo, Zomma, Lio, Pactum, Pavus AI, Adonis, Amperos Health, Candid Health, ClearRisk AI, Notch, Ivo, Wordsmith, Orbio, Spott, Take2, NeuBird AI</w:t>
+        <w:t xml:space="preserve"> RapidCanvas</w:t>
       </w:r>
     </w:p>
     <w:p>
@@ -18635,7 +18605,7 @@
           <w:b/>
           <w:bdr w:val="single" w:sz="2" w:space="3" w:color="BBBBBB"/>
         </w:rPr>
-        <w:t>Runs inside or on top of a system of record (SAP, Oracle, ServiceNow, existing EHR or email)</w:t>
+        <w:t>Not disclosed in any filed source</w:t>
       </w:r>
     </w:p>
     <w:p>
@@ -18665,7 +18635,7 @@
           <w:sz w:val="19"/>
           <w:bdr w:val="single" w:sz="2" w:space="3" w:color="BBBBBB"/>
         </w:rPr>
-        <w:t xml:space="preserve"> 5</w:t>
+        <w:t xml:space="preserve"> 85</w:t>
       </w:r>
     </w:p>
     <w:p>
@@ -18695,7 +18665,37 @@
           <w:sz w:val="19"/>
           <w:bdr w:val="single" w:sz="2" w:space="3" w:color="BBBBBB"/>
         </w:rPr>
-        <w:t xml:space="preserve"> Moveworks, Didero, Magentic, Walter, GenHealth.ai</w:t>
+        <w:t xml:space="preserve"> CopilotKit, Coval, Dash0, Daytona, Flexprice, InsightFinder, Natural, Raindrop, Rein, Runlayer, LangChain, ElevenLabs, Sycamore, Airia, Maisa AI, Mimica, Skan AI, Workfabric AI, Actively AI, Attention, Omilia, respond.io, Moveworks, Adaptive, Basis, Definite, Elimentary, Xelix, Zolvo, Zomma, Didero, Lio, Magentic, Walter, Pactum, Pavus AI, Adonis, Amperos Health, Candid Health, GenHealth.ai, ClearRisk AI, Notch, Pace, Otera, Ivo, Wordsmith, Orbio, Spott, Take2, NeuBird AI, AuxoAI, Rillet, Campfire, Tabs, Stuut, Tennr, Assort Health, Sixfold, Reserv, Harper, Federato, Eudia, Supio, ConverzAI, Juicebox, Rox, Unify, Parloa, Lorikeet, Gradient Labs, Resolve AI, Traversal, Serval, EliseAI, HappyRobot, Augment, GovDash, Polimorphic, Levelpath, Omnea, Distyl AI, Relevance AI, n8n, Glean, PolyAI</w:t>
+      </w:r>
+    </w:p>
+    <w:p>
+      <w:pPr>
+        <w:pStyle w:val="BodyText"/>
+        <w:bidi w:val="0"/>
+        <w:jc w:val="left"/>
+        <w:rPr/>
+      </w:pPr>
+      <w:r>
+        <w:rPr>
+          <w:rStyle w:val="Strong"/>
+        </w:rPr>
+        <w:t>What this means:</w:t>
+      </w:r>
+      <w:r>
+        <w:rPr/>
+        <w:t xml:space="preserve"> buyer-verified prices are per transaction; true outcome pricing is only claimed, by five startups. 85 of 101 have no disclosed price.</w:t>
+      </w:r>
+    </w:p>
+    <w:p>
+      <w:pPr>
+        <w:pStyle w:val="Heading3"/>
+        <w:bidi w:val="0"/>
+        <w:jc w:val="left"/>
+        <w:rPr/>
+      </w:pPr>
+      <w:r>
+        <w:rPr/>
+        <w:t>8.4 Go-to-market channel</w:t>
       </w:r>
     </w:p>
     <w:p>
@@ -18716,7 +18716,7 @@
           <w:b/>
           <w:bdr w:val="single" w:sz="2" w:space="3" w:color="BBBBBB"/>
         </w:rPr>
-        <w:t>Sold or delivered through an SI, BPO or channel partner</w:t>
+        <w:t>Direct to the enterprise (no partner named in sources)</w:t>
       </w:r>
     </w:p>
     <w:p>
@@ -18746,7 +18746,7 @@
           <w:sz w:val="19"/>
           <w:bdr w:val="single" w:sz="2" w:space="3" w:color="BBBBBB"/>
         </w:rPr>
-        <w:t xml:space="preserve"> 4</w:t>
+        <w:t xml:space="preserve"> 73</w:t>
       </w:r>
     </w:p>
     <w:p>
@@ -18776,7 +18776,7 @@
           <w:sz w:val="19"/>
           <w:bdr w:val="single" w:sz="2" w:space="3" w:color="BBBBBB"/>
         </w:rPr>
-        <w:t xml:space="preserve"> DeepOpinion, Workfabric AI, Vida, Otera</w:t>
+        <w:t xml:space="preserve"> Coval, Dash0, Daytona, InsightFinder, Natural, Raindrop, Rein, Runlayer, Tsuga, ElevenLabs, Ema, Duvo, Sycamore, Airia, Maisa AI, Mimica, Skan AI, Actively AI, Attention, Sierra, Decagon, Omilia, respond.io, Cresta, Adaptive, Basis, Definite, Elimentary, Xelix, Zolvo, Zomma, Lio, Pactum, Pavus AI, Adonis, Amperos Health, Candid Health, ClearRisk AI, Notch, Ivo, Wordsmith, Orbio, Spott, Take2, NeuBird AI, Rillet, Campfire, Tabs, Federato, Eudia, Supio, EvenUp, ConverzAI, Juicebox, Unify, Parloa, Lorikeet, Gradient Labs, Resolve AI, Traversal, Serval, EliseAI, HappyRobot, Augment, GovDash, Polimorphic, Levelpath, Omnea, Relevance AI, Unframe, Glean, PolyAI, Distyl AI</w:t>
       </w:r>
     </w:p>
     <w:p>
@@ -18797,7 +18797,7 @@
           <w:b/>
           <w:bdr w:val="single" w:sz="2" w:space="3" w:color="BBBBBB"/>
         </w:rPr>
-        <w:t>Sells the finished work (AI-native service firm or BPO replacement)</w:t>
+        <w:t>Runs inside or on top of a system of record (SAP, Oracle, ServiceNow, existing EHR or email)</w:t>
       </w:r>
     </w:p>
     <w:p>
@@ -18827,7 +18827,7 @@
           <w:sz w:val="19"/>
           <w:bdr w:val="single" w:sz="2" w:space="3" w:color="BBBBBB"/>
         </w:rPr>
-        <w:t xml:space="preserve"> 7</w:t>
+        <w:t xml:space="preserve"> 10</w:t>
       </w:r>
     </w:p>
     <w:p>
@@ -18857,7 +18857,7 @@
           <w:sz w:val="19"/>
           <w:bdr w:val="single" w:sz="2" w:space="3" w:color="BBBBBB"/>
         </w:rPr>
-        <w:t xml:space="preserve"> Procode, Prosper AI, Pace, Crosby, Crescendo, RapidCanvas, AuxoAI</w:t>
+        <w:t xml:space="preserve"> Moveworks, Didero, Magentic, Walter, GenHealth.ai, Sixfold, Stuut, Tennr, Assort Health, Rox</w:t>
       </w:r>
     </w:p>
     <w:p>
@@ -18878,7 +18878,7 @@
           <w:b/>
           <w:bdr w:val="single" w:sz="2" w:space="3" w:color="BBBBBB"/>
         </w:rPr>
-        <w:t>Open source or developer-led</w:t>
+        <w:t>Sold or delivered through an SI, BPO or channel partner</w:t>
       </w:r>
     </w:p>
     <w:p>
@@ -18938,37 +18938,7 @@
           <w:sz w:val="19"/>
           <w:bdr w:val="single" w:sz="2" w:space="3" w:color="BBBBBB"/>
         </w:rPr>
-        <w:t xml:space="preserve"> CopilotKit, Flexprice, LangChain, Kestra</w:t>
-      </w:r>
-    </w:p>
-    <w:p>
-      <w:pPr>
-        <w:pStyle w:val="BodyText"/>
-        <w:bidi w:val="0"/>
-        <w:jc w:val="left"/>
-        <w:rPr/>
-      </w:pPr>
-      <w:r>
-        <w:rPr>
-          <w:rStyle w:val="Strong"/>
-        </w:rPr>
-        <w:t>What this means:</w:t>
-      </w:r>
-      <w:r>
-        <w:rPr/>
-        <w:t xml:space="preserve"> direct sale dominates; all three SI-delivered startups run through Cognizant, so "SIs as channel" rests on one SI [src-20260724-b4a442] [src-20250627-297f7b] [src-20260710-e2a61b].</w:t>
-      </w:r>
-    </w:p>
-    <w:p>
-      <w:pPr>
-        <w:pStyle w:val="Heading3"/>
-        <w:bidi w:val="0"/>
-        <w:jc w:val="left"/>
-        <w:rPr/>
-      </w:pPr>
-      <w:r>
-        <w:rPr/>
-        <w:t>8.5 Stage</w:t>
+        <w:t xml:space="preserve"> DeepOpinion, Workfabric AI, Vida, Otera</w:t>
       </w:r>
     </w:p>
     <w:p>
@@ -18989,7 +18959,7 @@
           <w:b/>
           <w:bdr w:val="single" w:sz="2" w:space="3" w:color="BBBBBB"/>
         </w:rPr>
-        <w:t>Seed</w:t>
+        <w:t>Sells the finished work (AI-native service firm or BPO replacement)</w:t>
       </w:r>
     </w:p>
     <w:p>
@@ -19019,7 +18989,7 @@
           <w:sz w:val="19"/>
           <w:bdr w:val="single" w:sz="2" w:space="3" w:color="BBBBBB"/>
         </w:rPr>
-        <w:t xml:space="preserve"> 7</w:t>
+        <w:t xml:space="preserve"> 9</w:t>
       </w:r>
     </w:p>
     <w:p>
@@ -19049,7 +19019,7 @@
           <w:sz w:val="19"/>
           <w:bdr w:val="single" w:sz="2" w:space="3" w:color="BBBBBB"/>
         </w:rPr>
-        <w:t xml:space="preserve"> Flexprice, Sycamore, Definite, Elimentary, Zolvo, Zomma, Walter</w:t>
+        <w:t xml:space="preserve"> Procode, Prosper AI, Pace, Crosby, Crescendo, RapidCanvas, AuxoAI, Harper, Reserv</w:t>
       </w:r>
     </w:p>
     <w:p>
@@ -19070,7 +19040,7 @@
           <w:b/>
           <w:bdr w:val="single" w:sz="2" w:space="3" w:color="BBBBBB"/>
         </w:rPr>
-        <w:t>Series A</w:t>
+        <w:t>Open source or developer-led</w:t>
       </w:r>
     </w:p>
     <w:p>
@@ -19100,7 +19070,7 @@
           <w:sz w:val="19"/>
           <w:bdr w:val="single" w:sz="2" w:space="3" w:color="BBBBBB"/>
         </w:rPr>
-        <w:t xml:space="preserve"> 22</w:t>
+        <w:t xml:space="preserve"> 5</w:t>
       </w:r>
     </w:p>
     <w:p>
@@ -19130,7 +19100,37 @@
           <w:sz w:val="19"/>
           <w:bdr w:val="single" w:sz="2" w:space="3" w:color="BBBBBB"/>
         </w:rPr>
-        <w:t xml:space="preserve"> CopilotKit, Coval, Natural, Raindrop, Rein, Runlayer, Tsuga, Kestra, Duvo, Didero, Lio, Magentic, Amperos Health, GenHealth.ai, Procode, ClearRisk AI, Notch, Otera, Orbio, Spott, Take2, AuxoAI</w:t>
+        <w:t xml:space="preserve"> CopilotKit, Flexprice, LangChain, Kestra, n8n</w:t>
+      </w:r>
+    </w:p>
+    <w:p>
+      <w:pPr>
+        <w:pStyle w:val="BodyText"/>
+        <w:bidi w:val="0"/>
+        <w:jc w:val="left"/>
+        <w:rPr/>
+      </w:pPr>
+      <w:r>
+        <w:rPr>
+          <w:rStyle w:val="Strong"/>
+        </w:rPr>
+        <w:t>What this means:</w:t>
+      </w:r>
+      <w:r>
+        <w:rPr/>
+        <w:t xml:space="preserve"> direct sale dominates (73 of 101). Added names that ride a record: Sixfold (inside policy admin systems, Guidewire invested), Stuut (existing ERPs), Tennr (writes to the EHR per a16z), Assort Health (embeds in the EHR), Rox (plugs into Salesforce and Zendesk). Harper (licensed agency) and Reserv (TPA) sell the work. The added 36 brought no new SI channel; all three SI-delivered startups run through Cognizant, so "SIs as channel" rests on one SI [src-20260724-b4a442] [src-20250627-297f7b] [src-20260710-e2a61b].</w:t>
+      </w:r>
+    </w:p>
+    <w:p>
+      <w:pPr>
+        <w:pStyle w:val="Heading3"/>
+        <w:bidi w:val="0"/>
+        <w:jc w:val="left"/>
+        <w:rPr/>
+      </w:pPr>
+      <w:r>
+        <w:rPr/>
+        <w:t>8.5 Stage</w:t>
       </w:r>
     </w:p>
     <w:p>
@@ -19151,7 +19151,7 @@
           <w:b/>
           <w:bdr w:val="single" w:sz="2" w:space="3" w:color="BBBBBB"/>
         </w:rPr>
-        <w:t>Series B</w:t>
+        <w:t>Seed</w:t>
       </w:r>
     </w:p>
     <w:p>
@@ -19181,7 +19181,7 @@
           <w:sz w:val="19"/>
           <w:bdr w:val="single" w:sz="2" w:space="3" w:color="BBBBBB"/>
         </w:rPr>
-        <w:t xml:space="preserve"> 18</w:t>
+        <w:t xml:space="preserve"> 7</w:t>
       </w:r>
     </w:p>
     <w:p>
@@ -19211,7 +19211,7 @@
           <w:sz w:val="19"/>
           <w:bdr w:val="single" w:sz="2" w:space="3" w:color="BBBBBB"/>
         </w:rPr>
-        <w:t xml:space="preserve"> Dash0, Daytona, InsightFinder, Ema, Mimica, Actively AI, Attention, Omilia, respond.io, Adaptive, Basis, Xelix, Pace, Crosby, Ivo, Wordsmith, NeuBird AI, RapidCanvas</w:t>
+        <w:t xml:space="preserve"> Flexprice, Sycamore, Definite, Elimentary, Zolvo, Zomma, Walter</w:t>
       </w:r>
     </w:p>
     <w:p>
@@ -19232,7 +19232,7 @@
           <w:b/>
           <w:bdr w:val="single" w:sz="2" w:space="3" w:color="BBBBBB"/>
         </w:rPr>
-        <w:t>Series C</w:t>
+        <w:t>Series A</w:t>
       </w:r>
     </w:p>
     <w:p>
@@ -19262,7 +19262,7 @@
           <w:sz w:val="19"/>
           <w:bdr w:val="single" w:sz="2" w:space="3" w:color="BBBBBB"/>
         </w:rPr>
-        <w:t xml:space="preserve"> 2</w:t>
+        <w:t xml:space="preserve"> 34</w:t>
       </w:r>
     </w:p>
     <w:p>
@@ -19292,7 +19292,7 @@
           <w:sz w:val="19"/>
           <w:bdr w:val="single" w:sz="2" w:space="3" w:color="BBBBBB"/>
         </w:rPr>
-        <w:t xml:space="preserve"> Skan AI, Adonis</w:t>
+        <w:t xml:space="preserve"> CopilotKit, Coval, Natural, Raindrop, Rein, Runlayer, Tsuga, Kestra, Duvo, Didero, Lio, Magentic, Amperos Health, GenHealth.ai, Procode, ClearRisk AI, Notch, Otera, Orbio, Spott, Take2, AuxoAI, Stuut, Harper, Eudia, ConverzAI, Juicebox, Lorikeet, Gradient Labs, Resolve AI, Traversal, Augment, Polimorphic, Unframe</w:t>
       </w:r>
     </w:p>
     <w:p>
@@ -19313,7 +19313,7 @@
           <w:b/>
           <w:bdr w:val="single" w:sz="2" w:space="3" w:color="BBBBBB"/>
         </w:rPr>
-        <w:t>Series D or later / late private</w:t>
+        <w:t>Series B</w:t>
       </w:r>
     </w:p>
     <w:p>
@@ -19343,7 +19343,7 @@
           <w:sz w:val="19"/>
           <w:bdr w:val="single" w:sz="2" w:space="3" w:color="BBBBBB"/>
         </w:rPr>
-        <w:t xml:space="preserve"> 2</w:t>
+        <w:t xml:space="preserve"> 33</w:t>
       </w:r>
     </w:p>
     <w:p>
@@ -19373,7 +19373,7 @@
           <w:sz w:val="19"/>
           <w:bdr w:val="single" w:sz="2" w:space="3" w:color="BBBBBB"/>
         </w:rPr>
-        <w:t xml:space="preserve"> Sierra, Candid Health</w:t>
+        <w:t xml:space="preserve"> Dash0, Daytona, InsightFinder, Ema, Mimica, Actively AI, Attention, Omilia, respond.io, Adaptive, Basis, Xelix, Pace, Crosby, Ivo, Wordsmith, NeuBird AI, RapidCanvas, Rillet, Campfire, Tabs, Sixfold, Reserv, Supio, Unify, Serval, HappyRobot, GovDash, Levelpath, Omnea, Distyl AI, Relevance AI, Assort Health</w:t>
       </w:r>
     </w:p>
     <w:p>
@@ -19394,7 +19394,7 @@
           <w:b/>
           <w:bdr w:val="single" w:sz="2" w:space="3" w:color="BBBBBB"/>
         </w:rPr>
-        <w:t>Stage not in filed sources</w:t>
+        <w:t>Series C</w:t>
       </w:r>
     </w:p>
     <w:p>
@@ -19424,7 +19424,7 @@
           <w:sz w:val="19"/>
           <w:bdr w:val="single" w:sz="2" w:space="3" w:color="BBBBBB"/>
         </w:rPr>
-        <w:t xml:space="preserve"> 14</w:t>
+        <w:t xml:space="preserve"> 4</w:t>
       </w:r>
     </w:p>
     <w:p>
@@ -19454,37 +19454,7 @@
           <w:sz w:val="19"/>
           <w:bdr w:val="single" w:sz="2" w:space="3" w:color="BBBBBB"/>
         </w:rPr>
-        <w:t xml:space="preserve"> LangChain, ElevenLabs, Airia, Maisa AI, DeepOpinion, Workfabric AI, Vida, Decagon, Cresta, Moveworks, Pactum, Pavus AI, Prosper AI, Crescendo</w:t>
-      </w:r>
-    </w:p>
-    <w:p>
-      <w:pPr>
-        <w:pStyle w:val="BodyText"/>
-        <w:bidi w:val="0"/>
-        <w:jc w:val="left"/>
-        <w:rPr/>
-      </w:pPr>
-      <w:r>
-        <w:rPr>
-          <w:rStyle w:val="Strong"/>
-        </w:rPr>
-        <w:t>What this means:</w:t>
-      </w:r>
-      <w:r>
-        <w:rPr/>
-        <w:t xml:space="preserve"> Series A and B are most of the universe; 14 have no stage on file.</w:t>
-      </w:r>
-    </w:p>
-    <w:p>
-      <w:pPr>
-        <w:pStyle w:val="Heading3"/>
-        <w:bidi w:val="0"/>
-        <w:jc w:val="left"/>
-        <w:rPr/>
-      </w:pPr>
-      <w:r>
-        <w:rPr/>
-        <w:t>8.6 Thesis position [inference]</w:t>
+        <w:t xml:space="preserve"> Skan AI, Adonis, Tennr, n8n</w:t>
       </w:r>
     </w:p>
     <w:p>
@@ -19505,7 +19475,7 @@
           <w:b/>
           <w:bdr w:val="single" w:sz="2" w:space="3" w:color="BBBBBB"/>
         </w:rPr>
-        <w:t>Fits: vertical app that owns a workflow</w:t>
+        <w:t>Series D or later / late private</w:t>
       </w:r>
     </w:p>
     <w:p>
@@ -19535,7 +19505,7 @@
           <w:sz w:val="19"/>
           <w:bdr w:val="single" w:sz="2" w:space="3" w:color="BBBBBB"/>
         </w:rPr>
-        <w:t xml:space="preserve"> 29</w:t>
+        <w:t xml:space="preserve"> 7</w:t>
       </w:r>
     </w:p>
     <w:p>
@@ -19565,7 +19535,7 @@
           <w:sz w:val="19"/>
           <w:bdr w:val="single" w:sz="2" w:space="3" w:color="BBBBBB"/>
         </w:rPr>
-        <w:t xml:space="preserve"> Actively AI, Attention, Vida, Sierra, Decagon, Omilia, respond.io, Cresta, Adaptive, Basis, Definite, Elimentary, Xelix, Zolvo, Zomma, Lio, Pactum, Pavus AI, Adonis, Amperos Health, Candid Health, ClearRisk AI, Notch, Ivo, Wordsmith, Orbio, Spott, Take2, NeuBird AI</w:t>
+        <w:t xml:space="preserve"> Sierra, Candid Health, Federato, Parloa, EvenUp, EliseAI, Glean</w:t>
       </w:r>
     </w:p>
     <w:p>
@@ -19586,7 +19556,7 @@
           <w:b/>
           <w:bdr w:val="single" w:sz="2" w:space="3" w:color="BBBBBB"/>
         </w:rPr>
-        <w:t>Fits: rides on the system of record</w:t>
+        <w:t>Stage not in filed sources</w:t>
       </w:r>
     </w:p>
     <w:p>
@@ -19616,7 +19586,7 @@
           <w:sz w:val="19"/>
           <w:bdr w:val="single" w:sz="2" w:space="3" w:color="BBBBBB"/>
         </w:rPr>
-        <w:t xml:space="preserve"> 5</w:t>
+        <w:t xml:space="preserve"> 16</w:t>
       </w:r>
     </w:p>
     <w:p>
@@ -19646,7 +19616,37 @@
           <w:sz w:val="19"/>
           <w:bdr w:val="single" w:sz="2" w:space="3" w:color="BBBBBB"/>
         </w:rPr>
-        <w:t xml:space="preserve"> Moveworks, Didero, Magentic, Walter, GenHealth.ai</w:t>
+        <w:t xml:space="preserve"> LangChain, ElevenLabs, Airia, Maisa AI, DeepOpinion, Workfabric AI, Vida, Decagon, Cresta, Moveworks, Pactum, Pavus AI, Prosper AI, Crescendo, Rox, PolyAI</w:t>
+      </w:r>
+    </w:p>
+    <w:p>
+      <w:pPr>
+        <w:pStyle w:val="BodyText"/>
+        <w:bidi w:val="0"/>
+        <w:jc w:val="left"/>
+        <w:rPr/>
+      </w:pPr>
+      <w:r>
+        <w:rPr>
+          <w:rStyle w:val="Strong"/>
+        </w:rPr>
+        <w:t>What this means:</w:t>
+      </w:r>
+      <w:r>
+        <w:rPr/>
+        <w:t xml:space="preserve"> Series A and B are most of the universe (67 of 101); 16 have no stage on file. Resolve AI's Series A was at a $1B valuation [src-20260204-8be226]; Serval's Series B too [src-20251211-c9227b].</w:t>
+      </w:r>
+    </w:p>
+    <w:p>
+      <w:pPr>
+        <w:pStyle w:val="Heading3"/>
+        <w:bidi w:val="0"/>
+        <w:jc w:val="left"/>
+        <w:rPr/>
+      </w:pPr>
+      <w:r>
+        <w:rPr/>
+        <w:t>8.6 Thesis position [inference]</w:t>
       </w:r>
     </w:p>
     <w:p>
@@ -19667,7 +19667,7 @@
           <w:b/>
           <w:bdr w:val="single" w:sz="2" w:space="3" w:color="BBBBBB"/>
         </w:rPr>
-        <w:t>Fits: sells the outcome as a service</w:t>
+        <w:t>Fits: vertical app that owns a workflow</w:t>
       </w:r>
     </w:p>
     <w:p>
@@ -19697,7 +19697,7 @@
           <w:sz w:val="19"/>
           <w:bdr w:val="single" w:sz="2" w:space="3" w:color="BBBBBB"/>
         </w:rPr>
-        <w:t xml:space="preserve"> 5</w:t>
+        <w:t xml:space="preserve"> 53</w:t>
       </w:r>
     </w:p>
     <w:p>
@@ -19727,7 +19727,7 @@
           <w:sz w:val="19"/>
           <w:bdr w:val="single" w:sz="2" w:space="3" w:color="BBBBBB"/>
         </w:rPr>
-        <w:t xml:space="preserve"> Procode, Prosper AI, Pace, Crosby, Crescendo</w:t>
+        <w:t xml:space="preserve"> Actively AI, Attention, Vida, Sierra, Decagon, Omilia, respond.io, Cresta, Adaptive, Basis, Definite, Elimentary, Xelix, Zolvo, Zomma, Lio, Pactum, Pavus AI, Adonis, Amperos Health, Candid Health, ClearRisk AI, Notch, Ivo, Wordsmith, Orbio, Spott, Take2, NeuBird AI, Rillet, Campfire, Tabs, Federato, Eudia, Supio, EvenUp, ConverzAI, Juicebox, Unify, Parloa, Lorikeet, Gradient Labs, Resolve AI, Traversal, Serval, EliseAI, HappyRobot, Augment, GovDash, Polimorphic, Levelpath, Omnea, PolyAI</w:t>
       </w:r>
     </w:p>
     <w:p>
@@ -19748,7 +19748,7 @@
           <w:b/>
           <w:bdr w:val="single" w:sz="2" w:space="3" w:color="BBBBBB"/>
         </w:rPr>
-        <w:t>Channel: SI, BPO or managed service</w:t>
+        <w:t>Fits: rides on the system of record</w:t>
       </w:r>
     </w:p>
     <w:p>
@@ -19778,7 +19778,7 @@
           <w:sz w:val="19"/>
           <w:bdr w:val="single" w:sz="2" w:space="3" w:color="BBBBBB"/>
         </w:rPr>
-        <w:t xml:space="preserve"> 4</w:t>
+        <w:t xml:space="preserve"> 10</w:t>
       </w:r>
     </w:p>
     <w:p>
@@ -19808,7 +19808,7 @@
           <w:sz w:val="19"/>
           <w:bdr w:val="single" w:sz="2" w:space="3" w:color="BBBBBB"/>
         </w:rPr>
-        <w:t xml:space="preserve"> DeepOpinion, Otera, RapidCanvas, AuxoAI</w:t>
+        <w:t xml:space="preserve"> Moveworks, Didero, Magentic, Walter, GenHealth.ai, Sixfold, Stuut, Tennr, Assort Health, Rox</w:t>
       </w:r>
     </w:p>
     <w:p>
@@ -19829,7 +19829,7 @@
           <w:b/>
           <w:bdr w:val="single" w:sz="2" w:space="3" w:color="BBBBBB"/>
         </w:rPr>
-        <w:t>Exposed: horizontal orchestration or context</w:t>
+        <w:t>Fits: sells the outcome as a service</w:t>
       </w:r>
     </w:p>
     <w:p>
@@ -19859,7 +19859,7 @@
           <w:sz w:val="19"/>
           <w:bdr w:val="single" w:sz="2" w:space="3" w:color="BBBBBB"/>
         </w:rPr>
-        <w:t xml:space="preserve"> 9</w:t>
+        <w:t xml:space="preserve"> 7</w:t>
       </w:r>
     </w:p>
     <w:p>
@@ -19889,7 +19889,7 @@
           <w:sz w:val="19"/>
           <w:bdr w:val="single" w:sz="2" w:space="3" w:color="BBBBBB"/>
         </w:rPr>
-        <w:t xml:space="preserve"> Ema, Kestra, Duvo, Sycamore, Airia, Maisa AI, Mimica, Skan AI, Workfabric AI</w:t>
+        <w:t xml:space="preserve"> Procode, Prosper AI, Pace, Crosby, Crescendo, Harper, Reserv</w:t>
       </w:r>
     </w:p>
     <w:p>
@@ -19910,7 +19910,7 @@
           <w:b/>
           <w:bdr w:val="single" w:sz="2" w:space="3" w:color="BBBBBB"/>
         </w:rPr>
-        <w:t>Neutral: picks and shovels (infra, evals, security)</w:t>
+        <w:t>Channel: SI, BPO or managed service</w:t>
       </w:r>
     </w:p>
     <w:p>
@@ -19940,7 +19940,7 @@
           <w:sz w:val="19"/>
           <w:bdr w:val="single" w:sz="2" w:space="3" w:color="BBBBBB"/>
         </w:rPr>
-        <w:t xml:space="preserve"> 13</w:t>
+        <w:t xml:space="preserve"> 5</w:t>
       </w:r>
     </w:p>
     <w:p>
@@ -19970,6 +19970,168 @@
           <w:sz w:val="19"/>
           <w:bdr w:val="single" w:sz="2" w:space="3" w:color="BBBBBB"/>
         </w:rPr>
+        <w:t xml:space="preserve"> DeepOpinion, Otera, RapidCanvas, AuxoAI, Distyl AI</w:t>
+      </w:r>
+    </w:p>
+    <w:p>
+      <w:pPr>
+        <w:pStyle w:val="BodyText"/>
+        <w:keepLines/>
+        <w:bidi w:val="0"/>
+        <w:spacing w:before="60" w:after="60"/>
+        <w:ind w:hanging="0" w:left="140" w:right="140"/>
+        <w:jc w:val="left"/>
+        <w:rPr>
+          <w:b/>
+          <w:bdr w:val="single" w:sz="2" w:space="3" w:color="BBBBBB"/>
+        </w:rPr>
+      </w:pPr>
+      <w:r>
+        <w:rPr>
+          <w:b/>
+          <w:bdr w:val="single" w:sz="2" w:space="3" w:color="BBBBBB"/>
+        </w:rPr>
+        <w:t>Exposed: horizontal orchestration or context</w:t>
+      </w:r>
+    </w:p>
+    <w:p>
+      <w:pPr>
+        <w:pStyle w:val="BodyText"/>
+        <w:keepLines/>
+        <w:bidi w:val="0"/>
+        <w:spacing w:before="20" w:after="20"/>
+        <w:ind w:hanging="0" w:left="160" w:right="160"/>
+        <w:jc w:val="left"/>
+        <w:rPr>
+          <w:sz w:val="19"/>
+          <w:bdr w:val="single" w:sz="2" w:space="3" w:color="BBBBBB"/>
+        </w:rPr>
+      </w:pPr>
+      <w:r>
+        <w:rPr>
+          <w:b/>
+          <w:color w:val="444444"/>
+          <w:sz w:val="19"/>
+          <w:bdr w:val="single" w:sz="2" w:space="3" w:color="BBBBBB"/>
+        </w:rPr>
+        <w:t>n:</w:t>
+      </w:r>
+      <w:r>
+        <w:rPr>
+          <w:sz w:val="19"/>
+          <w:bdr w:val="single" w:sz="2" w:space="3" w:color="BBBBBB"/>
+        </w:rPr>
+        <w:t xml:space="preserve"> 13</w:t>
+      </w:r>
+    </w:p>
+    <w:p>
+      <w:pPr>
+        <w:pStyle w:val="BodyText"/>
+        <w:keepLines/>
+        <w:bidi w:val="0"/>
+        <w:spacing w:before="20" w:after="20"/>
+        <w:ind w:hanging="0" w:left="160" w:right="160"/>
+        <w:jc w:val="left"/>
+        <w:rPr>
+          <w:sz w:val="19"/>
+          <w:bdr w:val="single" w:sz="2" w:space="3" w:color="BBBBBB"/>
+        </w:rPr>
+      </w:pPr>
+      <w:r>
+        <w:rPr>
+          <w:b/>
+          <w:color w:val="444444"/>
+          <w:sz w:val="19"/>
+          <w:bdr w:val="single" w:sz="2" w:space="3" w:color="BBBBBB"/>
+        </w:rPr>
+        <w:t>Who:</w:t>
+      </w:r>
+      <w:r>
+        <w:rPr>
+          <w:sz w:val="19"/>
+          <w:bdr w:val="single" w:sz="2" w:space="3" w:color="BBBBBB"/>
+        </w:rPr>
+        <w:t xml:space="preserve"> Ema, Kestra, Duvo, Sycamore, Airia, Maisa AI, Mimica, Skan AI, Workfabric AI, Relevance AI, n8n, Unframe, Glean</w:t>
+      </w:r>
+    </w:p>
+    <w:p>
+      <w:pPr>
+        <w:pStyle w:val="BodyText"/>
+        <w:keepLines/>
+        <w:bidi w:val="0"/>
+        <w:spacing w:before="60" w:after="60"/>
+        <w:ind w:hanging="0" w:left="140" w:right="140"/>
+        <w:jc w:val="left"/>
+        <w:rPr>
+          <w:b/>
+          <w:bdr w:val="single" w:sz="2" w:space="3" w:color="BBBBBB"/>
+        </w:rPr>
+      </w:pPr>
+      <w:r>
+        <w:rPr>
+          <w:b/>
+          <w:bdr w:val="single" w:sz="2" w:space="3" w:color="BBBBBB"/>
+        </w:rPr>
+        <w:t>Neutral: picks and shovels (infra, evals, security)</w:t>
+      </w:r>
+    </w:p>
+    <w:p>
+      <w:pPr>
+        <w:pStyle w:val="BodyText"/>
+        <w:keepLines/>
+        <w:bidi w:val="0"/>
+        <w:spacing w:before="20" w:after="20"/>
+        <w:ind w:hanging="0" w:left="160" w:right="160"/>
+        <w:jc w:val="left"/>
+        <w:rPr>
+          <w:sz w:val="19"/>
+          <w:bdr w:val="single" w:sz="2" w:space="3" w:color="BBBBBB"/>
+        </w:rPr>
+      </w:pPr>
+      <w:r>
+        <w:rPr>
+          <w:b/>
+          <w:color w:val="444444"/>
+          <w:sz w:val="19"/>
+          <w:bdr w:val="single" w:sz="2" w:space="3" w:color="BBBBBB"/>
+        </w:rPr>
+        <w:t>n:</w:t>
+      </w:r>
+      <w:r>
+        <w:rPr>
+          <w:sz w:val="19"/>
+          <w:bdr w:val="single" w:sz="2" w:space="3" w:color="BBBBBB"/>
+        </w:rPr>
+        <w:t xml:space="preserve"> 13</w:t>
+      </w:r>
+    </w:p>
+    <w:p>
+      <w:pPr>
+        <w:pStyle w:val="BodyText"/>
+        <w:keepLines/>
+        <w:bidi w:val="0"/>
+        <w:spacing w:before="20" w:after="20"/>
+        <w:ind w:hanging="0" w:left="160" w:right="160"/>
+        <w:jc w:val="left"/>
+        <w:rPr>
+          <w:sz w:val="19"/>
+          <w:bdr w:val="single" w:sz="2" w:space="3" w:color="BBBBBB"/>
+        </w:rPr>
+      </w:pPr>
+      <w:r>
+        <w:rPr>
+          <w:b/>
+          <w:color w:val="444444"/>
+          <w:sz w:val="19"/>
+          <w:bdr w:val="single" w:sz="2" w:space="3" w:color="BBBBBB"/>
+        </w:rPr>
+        <w:t>Who:</w:t>
+      </w:r>
+      <w:r>
+        <w:rPr>
+          <w:sz w:val="19"/>
+          <w:bdr w:val="single" w:sz="2" w:space="3" w:color="BBBBBB"/>
+        </w:rPr>
         <w:t xml:space="preserve"> CopilotKit, Coval, Dash0, Daytona, Flexprice, InsightFinder, Natural, Raindrop, Rein, Runlayer, Tsuga, LangChain, ElevenLabs</w:t>
       </w:r>
     </w:p>
@@ -19988,7 +20150,7 @@
       </w:r>
       <w:r>
         <w:rPr/>
-        <w:t xml:space="preserve"> six in ten fit the thesis; the horizontal group carries the most absorption risk from labs and systems of record.</w:t>
+        <w:t xml:space="preserve"> about seven in ten (70 of 101) fit the thesis; the horizontal group (13) carries the most absorption risk from labs and systems of record. New pattern in the additions [inference]: vertical apps that replace the record rather than ride on it (Rillet, Campfire, Serval, Federato), and incumbents investing in agents on their own records (Guidewire in Sixfold, Thomson Reuters Ventures in Supio, RELX's REV in EvenUp).</w:t>
       </w:r>
     </w:p>
     <w:p>
@@ -21385,6 +21547,7 @@
           <w:tab w:val="left" w:pos="769" w:leader="none"/>
         </w:tabs>
         <w:bidi w:val="0"/>
+        <w:spacing w:before="60" w:after="0"/>
         <w:ind w:hanging="283" w:left="769"/>
         <w:jc w:val="left"/>
         <w:rPr/>
@@ -21397,6 +21560,27 @@
     <w:p>
       <w:pPr>
         <w:pStyle w:val="BodyText"/>
+        <w:numPr>
+          <w:ilvl w:val="0"/>
+          <w:numId w:val="58"/>
+        </w:numPr>
+        <w:tabs>
+          <w:tab w:val="clear" w:pos="1134"/>
+          <w:tab w:val="left" w:pos="769" w:leader="none"/>
+        </w:tabs>
+        <w:bidi w:val="0"/>
+        <w:ind w:hanging="283" w:left="769"/>
+        <w:jc w:val="left"/>
+        <w:rPr/>
+      </w:pPr>
+      <w:r>
+        <w:rPr/>
+        <w:t xml:space="preserve">v3 (2026-10-28), for Section 8: six VC primers read in full: Foundation Capital services-as-software year one src-20250703-8a38e7; a16z "The Incumbents Are Coming" src-20260903-a696de; a16z "RIP to RPA" src-20241113-d5f4fa (dated 2024-11); Bessemer State of AI 2025 src-20250813-44ef93; Bessemer IT services roadmap src-20251028-1ffc30; Bessemer vertical AI part IV src-20250128-3948ca. Plus 35 startup sources (funding reports and company blogs), each read in full: src-20250806-b579d5, src-20251015-1d9298, src-20250916-6b0cd0, src-20251120-b7dfc3, src-20250618-89929d, src-20251002-499204, src-20260129-3fadee, src-20250604-fd80b0, src-20260225-3917a2, src-20251118-a1bc08, src-20250213-7eb7f6, src-20250430-935fd7, src-20251007-efb7da, src-20250211-780a74, src-20250925-7d17f1, src-20260312-b92bcd, src-20250714-a49000, src-20260115-f3635c, src-20250806-000216, src-20250530-b93251, src-20260204-8be226, src-20250618-b909ed, src-20251211-c9227b, src-20250820-5c5edf, src-20250903-f1a523, src-20250904-fe3d9b, src-20260115-edd4ec, src-20250709-395aa2, src-20250630-c0d572, src-20250917-786a38, src-20250922-1bc8b4, src-20250506-6ff4ce, src-20251009-9cd90b, src-20250403-82b140, src-20250610-0a09d0. </w:t>
+      </w:r>
+    </w:p>
+    <w:p>
+      <w:pPr>
+        <w:pStyle w:val="BodyText"/>
         <w:bidi w:val="0"/>
         <w:jc w:val="left"/>
         <w:rPr/>
@@ -21820,6 +22004,28 @@
           <w:tab w:val="left" w:pos="769" w:leader="none"/>
         </w:tabs>
         <w:bidi w:val="0"/>
+        <w:spacing w:before="60" w:after="0"/>
+        <w:ind w:hanging="283" w:left="769"/>
+        <w:jc w:val="left"/>
+        <w:rPr/>
+      </w:pPr>
+      <w:r>
+        <w:rPr/>
+        <w:t xml:space="preserve">src-20260310-e66bf3: the expert now works at ElevenLabs, a competitor. </w:t>
+      </w:r>
+    </w:p>
+    <w:p>
+      <w:pPr>
+        <w:pStyle w:val="BodyText"/>
+        <w:numPr>
+          <w:ilvl w:val="0"/>
+          <w:numId w:val="61"/>
+        </w:numPr>
+        <w:tabs>
+          <w:tab w:val="clear" w:pos="1134"/>
+          <w:tab w:val="left" w:pos="769" w:leader="none"/>
+        </w:tabs>
+        <w:bidi w:val="0"/>
         <w:spacing w:before="60" w:after="60"/>
         <w:ind w:hanging="283" w:left="769"/>
         <w:jc w:val="left"/>
@@ -21827,7 +22033,7 @@
       </w:pPr>
       <w:r>
         <w:rPr/>
-        <w:t xml:space="preserve">src-20260310-e66bf3: the expert now works at ElevenLabs, a competitor. </w:t>
+        <w:t xml:space="preserve">v3 funding reports: most are company press releases or trade write-ups of them, so company claims. src-20250714-a49000 (Unify) date is taken from a BusinessWire listing; the blog page metadata says 2026-03-10. Rox's $1.2B valuation is "according to multiple sources" [src-20260312-b92bcd]. PolyAI's round stage is not in the source [src-20260115-f3635c]. </w:t>
       </w:r>
     </w:p>
     <w:sectPr>

</xml_diff>